<commit_message>
resultado esperado (con calculadora)
</commit_message>
<xml_diff>
--- a/DVVDS/T2.0/T2.0.docx
+++ b/DVVDS/T2.0/T2.0.docx
@@ -1,6 +1,6 @@
 
 <file path=word/document.xml><?xml version="1.0" encoding="utf-8"?>
-<w:document xmlns:wpc="http://schemas.microsoft.com/office/word/2010/wordprocessingCanvas" xmlns:cx="http://schemas.microsoft.com/office/drawing/2014/chartex" xmlns:cx1="http://schemas.microsoft.com/office/drawing/2015/9/8/chartex" xmlns:cx2="http://schemas.microsoft.com/office/drawing/2015/10/21/chartex" xmlns:cx3="http://schemas.microsoft.com/office/drawing/2016/5/9/chartex" xmlns:cx4="http://schemas.microsoft.com/office/drawing/2016/5/10/chartex" xmlns:cx5="http://schemas.microsoft.com/office/drawing/2016/5/11/chartex" xmlns:cx6="http://schemas.microsoft.com/office/drawing/2016/5/12/chartex" xmlns:cx7="http://schemas.microsoft.com/office/drawing/2016/5/13/chartex" xmlns:cx8="http://schemas.microsoft.com/office/drawing/2016/5/14/chartex" xmlns:mc="http://schemas.openxmlformats.org/markup-compatibility/2006" xmlns:aink="http://schemas.microsoft.com/office/drawing/2016/ink" xmlns:am3d="http://schemas.microsoft.com/office/drawing/2017/model3d" xmlns:o="urn:schemas-microsoft-com:office:office" xmlns:oel="http://schemas.microsoft.com/office/2019/extlst" xmlns:r="http://schemas.openxmlformats.org/officeDocument/2006/relationships" xmlns:m="http://schemas.openxmlformats.org/officeDocument/2006/math" xmlns:v="urn:schemas-microsoft-com:vml" xmlns:wp14="http://schemas.microsoft.com/office/word/2010/wordprocessingDrawing" xmlns:wp="http://schemas.openxmlformats.org/drawingml/2006/wordprocessingDrawing" xmlns:w10="urn:schemas-microsoft-com:office:word" xmlns:w="http://schemas.openxmlformats.org/wordprocessingml/2006/main" xmlns:w14="http://schemas.microsoft.com/office/word/2010/wordml" xmlns:w15="http://schemas.microsoft.com/office/word/2012/wordml" xmlns:w16cei="http://schemas.microsoft.com/office/word/2026/wordml/cei" xmlns:w16cex="http://schemas.microsoft.com/office/word/2018/wordml/cex" xmlns:w16cid="http://schemas.microsoft.com/office/word/2016/wordml/cid" xmlns:w16="http://schemas.microsoft.com/office/word/2018/wordml" xmlns:w16du="http://schemas.microsoft.com/office/word/2023/wordml/word16du" xmlns:w16sdtdh="http://schemas.microsoft.com/office/word/2020/wordml/sdtdatahash" xmlns:w16sdtfl="http://schemas.microsoft.com/office/word/2024/wordml/sdtformatlock" xmlns:w16se="http://schemas.microsoft.com/office/word/2015/wordml/symex" xmlns:wpg="http://schemas.microsoft.com/office/word/2010/wordprocessingGroup" xmlns:wpi="http://schemas.microsoft.com/office/word/2010/wordprocessingInk" xmlns:wne="http://schemas.microsoft.com/office/word/2006/wordml" xmlns:wps="http://schemas.microsoft.com/office/word/2010/wordprocessingShape" mc:Ignorable="w14 w15 w16se w16cid w16 w16cex w16sdtdh w16sdtfl w16du wp14">
+<w:document xmlns:wpc="http://schemas.microsoft.com/office/word/2010/wordprocessingCanvas" xmlns:cx="http://schemas.microsoft.com/office/drawing/2014/chartex" xmlns:cx1="http://schemas.microsoft.com/office/drawing/2015/9/8/chartex" xmlns:cx2="http://schemas.microsoft.com/office/drawing/2015/10/21/chartex" xmlns:cx3="http://schemas.microsoft.com/office/drawing/2016/5/9/chartex" xmlns:cx4="http://schemas.microsoft.com/office/drawing/2016/5/10/chartex" xmlns:cx5="http://schemas.microsoft.com/office/drawing/2016/5/11/chartex" xmlns:cx6="http://schemas.microsoft.com/office/drawing/2016/5/12/chartex" xmlns:cx7="http://schemas.microsoft.com/office/drawing/2016/5/13/chartex" xmlns:cx8="http://schemas.microsoft.com/office/drawing/2016/5/14/chartex" xmlns:mc="http://schemas.openxmlformats.org/markup-compatibility/2006" xmlns:aink="http://schemas.microsoft.com/office/drawing/2016/ink" xmlns:am3d="http://schemas.microsoft.com/office/drawing/2017/model3d" xmlns:o="urn:schemas-microsoft-com:office:office" xmlns:oel="http://schemas.microsoft.com/office/2019/extlst" xmlns:r="http://schemas.openxmlformats.org/officeDocument/2006/relationships" xmlns:m="http://schemas.openxmlformats.org/officeDocument/2006/math" xmlns:v="urn:schemas-microsoft-com:vml" xmlns:wp14="http://schemas.microsoft.com/office/word/2010/wordprocessingDrawing" xmlns:wp="http://schemas.openxmlformats.org/drawingml/2006/wordprocessingDrawing" xmlns:w10="urn:schemas-microsoft-com:office:word" xmlns:w="http://schemas.openxmlformats.org/wordprocessingml/2006/main" xmlns:w14="http://schemas.microsoft.com/office/word/2010/wordml" xmlns:w15="http://schemas.microsoft.com/office/word/2012/wordml" xmlns:w16cex="http://schemas.microsoft.com/office/word/2018/wordml/cex" xmlns:w16cid="http://schemas.microsoft.com/office/word/2016/wordml/cid" xmlns:w16="http://schemas.microsoft.com/office/word/2018/wordml" xmlns:w16du="http://schemas.microsoft.com/office/word/2023/wordml/word16du" xmlns:w16sdtdh="http://schemas.microsoft.com/office/word/2020/wordml/sdtdatahash" xmlns:w16sdtfl="http://schemas.microsoft.com/office/word/2024/wordml/sdtformatlock" xmlns:w16se="http://schemas.microsoft.com/office/word/2015/wordml/symex" xmlns:wpg="http://schemas.microsoft.com/office/word/2010/wordprocessingGroup" xmlns:wpi="http://schemas.microsoft.com/office/word/2010/wordprocessingInk" xmlns:wne="http://schemas.microsoft.com/office/word/2006/wordml" xmlns:wps="http://schemas.microsoft.com/office/word/2010/wordprocessingShape" mc:Ignorable="w14 w15 w16se w16cid w16 w16cex w16sdtdh w16sdtfl w16du wp14">
   <w:body>
     <w:p>
       <w:pPr>
@@ -20,6 +20,33 @@
           <w:lang w:eastAsia="en-US"/>
         </w:rPr>
       </w:pPr>
+      <w:r>
+        <w:rPr>
+          <w:rFonts w:ascii="Arial" w:hAnsi="Arial" w:cs="Arial"/>
+          <w:sz w:val="20"/>
+          <w:szCs w:val="20"/>
+          <w:lang w:val="en-US" w:eastAsia="en-US"/>
+        </w:rPr>
+        <w:t>J</w:t>
+      </w:r>
+      <w:r>
+        <w:rPr>
+          <w:rFonts w:ascii="Arial" w:hAnsi="Arial" w:cs="Arial"/>
+          <w:sz w:val="20"/>
+          <w:szCs w:val="20"/>
+          <w:lang w:val="en-US" w:eastAsia="en-US"/>
+        </w:rPr>
+        <w:t>os</w:t>
+      </w:r>
+      <w:r>
+        <w:rPr>
+          <w:rFonts w:ascii="Arial" w:hAnsi="Arial" w:cs="Arial"/>
+          <w:sz w:val="20"/>
+          <w:szCs w:val="20"/>
+          <w:lang w:eastAsia="en-US"/>
+        </w:rPr>
+        <w:t>é Sebastián González Ortega</w:t>
+      </w:r>
     </w:p>
     <w:p>
       <w:pPr>
@@ -36,7 +63,7 @@
           <w:rFonts w:ascii="Arial" w:hAnsi="Arial" w:cs="Arial"/>
           <w:sz w:val="20"/>
           <w:szCs w:val="20"/>
-          <w:lang w:eastAsia="en-US"/>
+          <w:lang w:val="en-US" w:eastAsia="en-US"/>
         </w:rPr>
       </w:pPr>
     </w:p>
@@ -44,64 +71,14 @@
       <w:pPr>
         <w:pStyle w:val="Title"/>
         <w:rPr>
-          <w:lang w:eastAsia="en-US"/>
-        </w:rPr>
-      </w:pPr>
-      <w:proofErr w:type="spellStart"/>
-      <w:r>
-        <w:rPr>
-          <w:lang w:eastAsia="en-US"/>
-        </w:rPr>
-        <w:t>Design</w:t>
-      </w:r>
-      <w:proofErr w:type="spellEnd"/>
-      <w:r>
-        <w:rPr>
-          <w:lang w:eastAsia="en-US"/>
-        </w:rPr>
-        <w:t xml:space="preserve"> and </w:t>
-      </w:r>
-      <w:proofErr w:type="spellStart"/>
-      <w:r>
-        <w:rPr>
-          <w:lang w:eastAsia="en-US"/>
-        </w:rPr>
-        <w:t>Verification</w:t>
-      </w:r>
-      <w:proofErr w:type="spellEnd"/>
-      <w:r>
-        <w:rPr>
-          <w:lang w:eastAsia="en-US"/>
-        </w:rPr>
-        <w:t xml:space="preserve"> </w:t>
-      </w:r>
-      <w:proofErr w:type="spellStart"/>
-      <w:r>
-        <w:rPr>
-          <w:lang w:eastAsia="en-US"/>
-        </w:rPr>
-        <w:t>of</w:t>
-      </w:r>
-      <w:proofErr w:type="spellEnd"/>
-      <w:r>
-        <w:rPr>
-          <w:lang w:eastAsia="en-US"/>
-        </w:rPr>
-        <w:t xml:space="preserve"> Digital </w:t>
-      </w:r>
-      <w:proofErr w:type="spellStart"/>
-      <w:r>
-        <w:rPr>
-          <w:lang w:eastAsia="en-US"/>
-        </w:rPr>
-        <w:t>Systems</w:t>
-      </w:r>
-      <w:proofErr w:type="spellEnd"/>
-      <w:r>
-        <w:rPr>
-          <w:lang w:eastAsia="en-US"/>
-        </w:rPr>
-        <w:t xml:space="preserve"> </w:t>
+          <w:lang w:val="en-US" w:eastAsia="en-US"/>
+        </w:rPr>
+      </w:pPr>
+      <w:r>
+        <w:rPr>
+          <w:lang w:val="en-US" w:eastAsia="en-US"/>
+        </w:rPr>
+        <w:t xml:space="preserve">Design and Verification of Digital Systems </w:t>
       </w:r>
     </w:p>
     <w:p>
@@ -118,349 +95,38 @@
           <w:rFonts w:ascii="Arial" w:hAnsi="Arial" w:cs="Arial"/>
           <w:sz w:val="20"/>
           <w:szCs w:val="20"/>
+          <w:lang w:val="en-US" w:eastAsia="en-US"/>
+        </w:rPr>
+        <w:t xml:space="preserve">Complete the design shown in picture 1. Then complete the pin planner and all processes needed to get the </w:t>
+      </w:r>
+      <w:proofErr w:type="spellStart"/>
+      <w:r>
+        <w:rPr>
+          <w:rFonts w:ascii="Arial" w:hAnsi="Arial" w:cs="Arial"/>
+          <w:sz w:val="20"/>
+          <w:szCs w:val="20"/>
+          <w:lang w:val="en-US" w:eastAsia="en-US"/>
+        </w:rPr>
+        <w:t>sof</w:t>
+      </w:r>
+      <w:proofErr w:type="spellEnd"/>
+      <w:r>
+        <w:rPr>
+          <w:rFonts w:ascii="Arial" w:hAnsi="Arial" w:cs="Arial"/>
+          <w:sz w:val="20"/>
+          <w:szCs w:val="20"/>
+          <w:lang w:val="en-US" w:eastAsia="en-US"/>
+        </w:rPr>
+        <w:t xml:space="preserve"> file and download it to the FPGA. </w:t>
+      </w:r>
+      <w:r>
+        <w:rPr>
+          <w:rFonts w:ascii="Arial" w:hAnsi="Arial" w:cs="Arial"/>
+          <w:sz w:val="20"/>
+          <w:szCs w:val="20"/>
           <w:lang w:eastAsia="en-US"/>
         </w:rPr>
-        <w:t xml:space="preserve">Complete </w:t>
-      </w:r>
-      <w:proofErr w:type="spellStart"/>
-      <w:r>
-        <w:rPr>
-          <w:rFonts w:ascii="Arial" w:hAnsi="Arial" w:cs="Arial"/>
-          <w:sz w:val="20"/>
-          <w:szCs w:val="20"/>
-          <w:lang w:eastAsia="en-US"/>
-        </w:rPr>
-        <w:t>the</w:t>
-      </w:r>
-      <w:proofErr w:type="spellEnd"/>
-      <w:r>
-        <w:rPr>
-          <w:rFonts w:ascii="Arial" w:hAnsi="Arial" w:cs="Arial"/>
-          <w:sz w:val="20"/>
-          <w:szCs w:val="20"/>
-          <w:lang w:eastAsia="en-US"/>
-        </w:rPr>
-        <w:t xml:space="preserve"> </w:t>
-      </w:r>
-      <w:proofErr w:type="spellStart"/>
-      <w:r>
-        <w:rPr>
-          <w:rFonts w:ascii="Arial" w:hAnsi="Arial" w:cs="Arial"/>
-          <w:sz w:val="20"/>
-          <w:szCs w:val="20"/>
-          <w:lang w:eastAsia="en-US"/>
-        </w:rPr>
-        <w:t>design</w:t>
-      </w:r>
-      <w:proofErr w:type="spellEnd"/>
-      <w:r>
-        <w:rPr>
-          <w:rFonts w:ascii="Arial" w:hAnsi="Arial" w:cs="Arial"/>
-          <w:sz w:val="20"/>
-          <w:szCs w:val="20"/>
-          <w:lang w:eastAsia="en-US"/>
-        </w:rPr>
-        <w:t xml:space="preserve"> </w:t>
-      </w:r>
-      <w:proofErr w:type="spellStart"/>
-      <w:r>
-        <w:rPr>
-          <w:rFonts w:ascii="Arial" w:hAnsi="Arial" w:cs="Arial"/>
-          <w:sz w:val="20"/>
-          <w:szCs w:val="20"/>
-          <w:lang w:eastAsia="en-US"/>
-        </w:rPr>
-        <w:t>shown</w:t>
-      </w:r>
-      <w:proofErr w:type="spellEnd"/>
-      <w:r>
-        <w:rPr>
-          <w:rFonts w:ascii="Arial" w:hAnsi="Arial" w:cs="Arial"/>
-          <w:sz w:val="20"/>
-          <w:szCs w:val="20"/>
-          <w:lang w:eastAsia="en-US"/>
-        </w:rPr>
-        <w:t xml:space="preserve"> in </w:t>
-      </w:r>
-      <w:proofErr w:type="spellStart"/>
-      <w:r>
-        <w:rPr>
-          <w:rFonts w:ascii="Arial" w:hAnsi="Arial" w:cs="Arial"/>
-          <w:sz w:val="20"/>
-          <w:szCs w:val="20"/>
-          <w:lang w:eastAsia="en-US"/>
-        </w:rPr>
-        <w:t>picture</w:t>
-      </w:r>
-      <w:proofErr w:type="spellEnd"/>
-      <w:r>
-        <w:rPr>
-          <w:rFonts w:ascii="Arial" w:hAnsi="Arial" w:cs="Arial"/>
-          <w:sz w:val="20"/>
-          <w:szCs w:val="20"/>
-          <w:lang w:eastAsia="en-US"/>
-        </w:rPr>
-        <w:t xml:space="preserve"> 1. Then complete </w:t>
-      </w:r>
-      <w:proofErr w:type="spellStart"/>
-      <w:r>
-        <w:rPr>
-          <w:rFonts w:ascii="Arial" w:hAnsi="Arial" w:cs="Arial"/>
-          <w:sz w:val="20"/>
-          <w:szCs w:val="20"/>
-          <w:lang w:eastAsia="en-US"/>
-        </w:rPr>
-        <w:t>the</w:t>
-      </w:r>
-      <w:proofErr w:type="spellEnd"/>
-      <w:r>
-        <w:rPr>
-          <w:rFonts w:ascii="Arial" w:hAnsi="Arial" w:cs="Arial"/>
-          <w:sz w:val="20"/>
-          <w:szCs w:val="20"/>
-          <w:lang w:eastAsia="en-US"/>
-        </w:rPr>
-        <w:t xml:space="preserve"> pin </w:t>
-      </w:r>
-      <w:proofErr w:type="spellStart"/>
-      <w:r>
-        <w:rPr>
-          <w:rFonts w:ascii="Arial" w:hAnsi="Arial" w:cs="Arial"/>
-          <w:sz w:val="20"/>
-          <w:szCs w:val="20"/>
-          <w:lang w:eastAsia="en-US"/>
-        </w:rPr>
-        <w:t>planner</w:t>
-      </w:r>
-      <w:proofErr w:type="spellEnd"/>
-      <w:r>
-        <w:rPr>
-          <w:rFonts w:ascii="Arial" w:hAnsi="Arial" w:cs="Arial"/>
-          <w:sz w:val="20"/>
-          <w:szCs w:val="20"/>
-          <w:lang w:eastAsia="en-US"/>
-        </w:rPr>
-        <w:t xml:space="preserve"> and </w:t>
-      </w:r>
-      <w:proofErr w:type="spellStart"/>
-      <w:r>
-        <w:rPr>
-          <w:rFonts w:ascii="Arial" w:hAnsi="Arial" w:cs="Arial"/>
-          <w:sz w:val="20"/>
-          <w:szCs w:val="20"/>
-          <w:lang w:eastAsia="en-US"/>
-        </w:rPr>
-        <w:t>all</w:t>
-      </w:r>
-      <w:proofErr w:type="spellEnd"/>
-      <w:r>
-        <w:rPr>
-          <w:rFonts w:ascii="Arial" w:hAnsi="Arial" w:cs="Arial"/>
-          <w:sz w:val="20"/>
-          <w:szCs w:val="20"/>
-          <w:lang w:eastAsia="en-US"/>
-        </w:rPr>
-        <w:t xml:space="preserve"> </w:t>
-      </w:r>
-      <w:proofErr w:type="spellStart"/>
-      <w:r>
-        <w:rPr>
-          <w:rFonts w:ascii="Arial" w:hAnsi="Arial" w:cs="Arial"/>
-          <w:sz w:val="20"/>
-          <w:szCs w:val="20"/>
-          <w:lang w:eastAsia="en-US"/>
-        </w:rPr>
-        <w:t>processes</w:t>
-      </w:r>
-      <w:proofErr w:type="spellEnd"/>
-      <w:r>
-        <w:rPr>
-          <w:rFonts w:ascii="Arial" w:hAnsi="Arial" w:cs="Arial"/>
-          <w:sz w:val="20"/>
-          <w:szCs w:val="20"/>
-          <w:lang w:eastAsia="en-US"/>
-        </w:rPr>
-        <w:t xml:space="preserve"> </w:t>
-      </w:r>
-      <w:proofErr w:type="spellStart"/>
-      <w:r>
-        <w:rPr>
-          <w:rFonts w:ascii="Arial" w:hAnsi="Arial" w:cs="Arial"/>
-          <w:sz w:val="20"/>
-          <w:szCs w:val="20"/>
-          <w:lang w:eastAsia="en-US"/>
-        </w:rPr>
-        <w:t>needed</w:t>
-      </w:r>
-      <w:proofErr w:type="spellEnd"/>
-      <w:r>
-        <w:rPr>
-          <w:rFonts w:ascii="Arial" w:hAnsi="Arial" w:cs="Arial"/>
-          <w:sz w:val="20"/>
-          <w:szCs w:val="20"/>
-          <w:lang w:eastAsia="en-US"/>
-        </w:rPr>
-        <w:t xml:space="preserve"> </w:t>
-      </w:r>
-      <w:proofErr w:type="spellStart"/>
-      <w:r>
-        <w:rPr>
-          <w:rFonts w:ascii="Arial" w:hAnsi="Arial" w:cs="Arial"/>
-          <w:sz w:val="20"/>
-          <w:szCs w:val="20"/>
-          <w:lang w:eastAsia="en-US"/>
-        </w:rPr>
-        <w:t>to</w:t>
-      </w:r>
-      <w:proofErr w:type="spellEnd"/>
-      <w:r>
-        <w:rPr>
-          <w:rFonts w:ascii="Arial" w:hAnsi="Arial" w:cs="Arial"/>
-          <w:sz w:val="20"/>
-          <w:szCs w:val="20"/>
-          <w:lang w:eastAsia="en-US"/>
-        </w:rPr>
-        <w:t xml:space="preserve"> </w:t>
-      </w:r>
-      <w:proofErr w:type="spellStart"/>
-      <w:r>
-        <w:rPr>
-          <w:rFonts w:ascii="Arial" w:hAnsi="Arial" w:cs="Arial"/>
-          <w:sz w:val="20"/>
-          <w:szCs w:val="20"/>
-          <w:lang w:eastAsia="en-US"/>
-        </w:rPr>
-        <w:t>get</w:t>
-      </w:r>
-      <w:proofErr w:type="spellEnd"/>
-      <w:r>
-        <w:rPr>
-          <w:rFonts w:ascii="Arial" w:hAnsi="Arial" w:cs="Arial"/>
-          <w:sz w:val="20"/>
-          <w:szCs w:val="20"/>
-          <w:lang w:eastAsia="en-US"/>
-        </w:rPr>
-        <w:t xml:space="preserve"> </w:t>
-      </w:r>
-      <w:proofErr w:type="spellStart"/>
-      <w:r>
-        <w:rPr>
-          <w:rFonts w:ascii="Arial" w:hAnsi="Arial" w:cs="Arial"/>
-          <w:sz w:val="20"/>
-          <w:szCs w:val="20"/>
-          <w:lang w:eastAsia="en-US"/>
-        </w:rPr>
-        <w:t>the</w:t>
-      </w:r>
-      <w:proofErr w:type="spellEnd"/>
-      <w:r>
-        <w:rPr>
-          <w:rFonts w:ascii="Arial" w:hAnsi="Arial" w:cs="Arial"/>
-          <w:sz w:val="20"/>
-          <w:szCs w:val="20"/>
-          <w:lang w:eastAsia="en-US"/>
-        </w:rPr>
-        <w:t xml:space="preserve"> </w:t>
-      </w:r>
-      <w:proofErr w:type="spellStart"/>
-      <w:r>
-        <w:rPr>
-          <w:rFonts w:ascii="Arial" w:hAnsi="Arial" w:cs="Arial"/>
-          <w:sz w:val="20"/>
-          <w:szCs w:val="20"/>
-          <w:lang w:eastAsia="en-US"/>
-        </w:rPr>
-        <w:t>sof</w:t>
-      </w:r>
-      <w:proofErr w:type="spellEnd"/>
-      <w:r>
-        <w:rPr>
-          <w:rFonts w:ascii="Arial" w:hAnsi="Arial" w:cs="Arial"/>
-          <w:sz w:val="20"/>
-          <w:szCs w:val="20"/>
-          <w:lang w:eastAsia="en-US"/>
-        </w:rPr>
-        <w:t xml:space="preserve"> file and </w:t>
-      </w:r>
-      <w:proofErr w:type="spellStart"/>
-      <w:r>
-        <w:rPr>
-          <w:rFonts w:ascii="Arial" w:hAnsi="Arial" w:cs="Arial"/>
-          <w:sz w:val="20"/>
-          <w:szCs w:val="20"/>
-          <w:lang w:eastAsia="en-US"/>
-        </w:rPr>
-        <w:t>download</w:t>
-      </w:r>
-      <w:proofErr w:type="spellEnd"/>
-      <w:r>
-        <w:rPr>
-          <w:rFonts w:ascii="Arial" w:hAnsi="Arial" w:cs="Arial"/>
-          <w:sz w:val="20"/>
-          <w:szCs w:val="20"/>
-          <w:lang w:eastAsia="en-US"/>
-        </w:rPr>
-        <w:t xml:space="preserve"> </w:t>
-      </w:r>
-      <w:proofErr w:type="spellStart"/>
-      <w:r>
-        <w:rPr>
-          <w:rFonts w:ascii="Arial" w:hAnsi="Arial" w:cs="Arial"/>
-          <w:sz w:val="20"/>
-          <w:szCs w:val="20"/>
-          <w:lang w:eastAsia="en-US"/>
-        </w:rPr>
-        <w:t>it</w:t>
-      </w:r>
-      <w:proofErr w:type="spellEnd"/>
-      <w:r>
-        <w:rPr>
-          <w:rFonts w:ascii="Arial" w:hAnsi="Arial" w:cs="Arial"/>
-          <w:sz w:val="20"/>
-          <w:szCs w:val="20"/>
-          <w:lang w:eastAsia="en-US"/>
-        </w:rPr>
-        <w:t xml:space="preserve"> </w:t>
-      </w:r>
-      <w:proofErr w:type="spellStart"/>
-      <w:r>
-        <w:rPr>
-          <w:rFonts w:ascii="Arial" w:hAnsi="Arial" w:cs="Arial"/>
-          <w:sz w:val="20"/>
-          <w:szCs w:val="20"/>
-          <w:lang w:eastAsia="en-US"/>
-        </w:rPr>
-        <w:t>to</w:t>
-      </w:r>
-      <w:proofErr w:type="spellEnd"/>
-      <w:r>
-        <w:rPr>
-          <w:rFonts w:ascii="Arial" w:hAnsi="Arial" w:cs="Arial"/>
-          <w:sz w:val="20"/>
-          <w:szCs w:val="20"/>
-          <w:lang w:eastAsia="en-US"/>
-        </w:rPr>
-        <w:t xml:space="preserve"> </w:t>
-      </w:r>
-      <w:proofErr w:type="spellStart"/>
-      <w:r>
-        <w:rPr>
-          <w:rFonts w:ascii="Arial" w:hAnsi="Arial" w:cs="Arial"/>
-          <w:sz w:val="20"/>
-          <w:szCs w:val="20"/>
-          <w:lang w:eastAsia="en-US"/>
-        </w:rPr>
-        <w:t>the</w:t>
-      </w:r>
-      <w:proofErr w:type="spellEnd"/>
-      <w:r>
-        <w:rPr>
-          <w:rFonts w:ascii="Arial" w:hAnsi="Arial" w:cs="Arial"/>
-          <w:sz w:val="20"/>
-          <w:szCs w:val="20"/>
-          <w:lang w:eastAsia="en-US"/>
-        </w:rPr>
-        <w:t xml:space="preserve"> FPGA. Test </w:t>
+        <w:t xml:space="preserve">Test </w:t>
       </w:r>
       <w:proofErr w:type="spellStart"/>
       <w:r>
@@ -572,226 +238,35 @@
           <w:rFonts w:ascii="Arial" w:hAnsi="Arial" w:cs="Arial"/>
           <w:sz w:val="20"/>
           <w:szCs w:val="20"/>
-          <w:lang w:eastAsia="en-US"/>
-        </w:rPr>
-      </w:pPr>
-      <w:r>
-        <w:rPr>
-          <w:rFonts w:ascii="Arial" w:hAnsi="Arial" w:cs="Arial"/>
-          <w:sz w:val="20"/>
-          <w:szCs w:val="20"/>
-          <w:lang w:eastAsia="en-US"/>
-        </w:rPr>
-        <w:t xml:space="preserve">Clock and </w:t>
-      </w:r>
-      <w:proofErr w:type="spellStart"/>
-      <w:r>
-        <w:rPr>
-          <w:rFonts w:ascii="Arial" w:hAnsi="Arial" w:cs="Arial"/>
-          <w:sz w:val="20"/>
-          <w:szCs w:val="20"/>
-          <w:lang w:eastAsia="en-US"/>
-        </w:rPr>
-        <w:t>reset</w:t>
-      </w:r>
-      <w:proofErr w:type="spellEnd"/>
-      <w:r>
-        <w:rPr>
-          <w:rFonts w:ascii="Arial" w:hAnsi="Arial" w:cs="Arial"/>
-          <w:sz w:val="20"/>
-          <w:szCs w:val="20"/>
-          <w:lang w:eastAsia="en-US"/>
-        </w:rPr>
-        <w:t xml:space="preserve"> </w:t>
-      </w:r>
-      <w:proofErr w:type="spellStart"/>
-      <w:r>
-        <w:rPr>
-          <w:rFonts w:ascii="Arial" w:hAnsi="Arial" w:cs="Arial"/>
-          <w:sz w:val="20"/>
-          <w:szCs w:val="20"/>
-          <w:lang w:eastAsia="en-US"/>
-        </w:rPr>
-        <w:t>signals</w:t>
-      </w:r>
-      <w:proofErr w:type="spellEnd"/>
-      <w:r>
-        <w:rPr>
-          <w:rFonts w:ascii="Arial" w:hAnsi="Arial" w:cs="Arial"/>
-          <w:sz w:val="20"/>
-          <w:szCs w:val="20"/>
-          <w:lang w:eastAsia="en-US"/>
-        </w:rPr>
-        <w:t xml:space="preserve"> are </w:t>
-      </w:r>
-      <w:proofErr w:type="spellStart"/>
-      <w:r>
-        <w:rPr>
-          <w:rFonts w:ascii="Arial" w:hAnsi="Arial" w:cs="Arial"/>
-          <w:sz w:val="20"/>
-          <w:szCs w:val="20"/>
-          <w:lang w:eastAsia="en-US"/>
-        </w:rPr>
-        <w:t>expected</w:t>
-      </w:r>
-      <w:proofErr w:type="spellEnd"/>
-      <w:r>
-        <w:rPr>
-          <w:rFonts w:ascii="Arial" w:hAnsi="Arial" w:cs="Arial"/>
-          <w:sz w:val="20"/>
-          <w:szCs w:val="20"/>
-          <w:lang w:eastAsia="en-US"/>
-        </w:rPr>
-        <w:t xml:space="preserve"> </w:t>
-      </w:r>
-      <w:proofErr w:type="spellStart"/>
-      <w:r>
-        <w:rPr>
-          <w:rFonts w:ascii="Arial" w:hAnsi="Arial" w:cs="Arial"/>
-          <w:sz w:val="20"/>
-          <w:szCs w:val="20"/>
-          <w:lang w:eastAsia="en-US"/>
-        </w:rPr>
-        <w:t>to</w:t>
-      </w:r>
-      <w:proofErr w:type="spellEnd"/>
-      <w:r>
-        <w:rPr>
-          <w:rFonts w:ascii="Arial" w:hAnsi="Arial" w:cs="Arial"/>
-          <w:sz w:val="20"/>
-          <w:szCs w:val="20"/>
-          <w:lang w:eastAsia="en-US"/>
-        </w:rPr>
-        <w:t xml:space="preserve"> be </w:t>
-      </w:r>
-      <w:proofErr w:type="spellStart"/>
-      <w:r>
-        <w:rPr>
-          <w:rFonts w:ascii="Arial" w:hAnsi="Arial" w:cs="Arial"/>
-          <w:sz w:val="20"/>
-          <w:szCs w:val="20"/>
-          <w:lang w:eastAsia="en-US"/>
-        </w:rPr>
-        <w:t>implemente</w:t>
-      </w:r>
-      <w:r>
-        <w:rPr>
-          <w:rFonts w:ascii="Arial" w:hAnsi="Arial" w:cs="Arial"/>
-          <w:sz w:val="20"/>
-          <w:szCs w:val="20"/>
-          <w:lang w:eastAsia="en-US"/>
+          <w:lang w:val="en-US" w:eastAsia="en-US"/>
+        </w:rPr>
+      </w:pPr>
+      <w:r>
+        <w:rPr>
+          <w:rFonts w:ascii="Arial" w:hAnsi="Arial" w:cs="Arial"/>
+          <w:sz w:val="20"/>
+          <w:szCs w:val="20"/>
+          <w:lang w:val="en-US" w:eastAsia="en-US"/>
+        </w:rPr>
+        <w:t>Clock and reset signals are expected to be implemente</w:t>
+      </w:r>
+      <w:r>
+        <w:rPr>
+          <w:rFonts w:ascii="Arial" w:hAnsi="Arial" w:cs="Arial"/>
+          <w:sz w:val="20"/>
+          <w:szCs w:val="20"/>
+          <w:lang w:val="en-US" w:eastAsia="en-US"/>
         </w:rPr>
         <w:t>d</w:t>
       </w:r>
-      <w:proofErr w:type="spellEnd"/>
-      <w:r>
-        <w:rPr>
-          <w:rFonts w:ascii="Arial" w:hAnsi="Arial" w:cs="Arial"/>
-          <w:sz w:val="20"/>
-          <w:szCs w:val="20"/>
-          <w:lang w:eastAsia="en-US"/>
-        </w:rPr>
-        <w:t xml:space="preserve"> and </w:t>
-      </w:r>
-      <w:proofErr w:type="spellStart"/>
-      <w:r>
-        <w:rPr>
-          <w:rFonts w:ascii="Arial" w:hAnsi="Arial" w:cs="Arial"/>
-          <w:sz w:val="20"/>
-          <w:szCs w:val="20"/>
-          <w:lang w:eastAsia="en-US"/>
-        </w:rPr>
-        <w:t>connected</w:t>
-      </w:r>
-      <w:proofErr w:type="spellEnd"/>
-      <w:r>
-        <w:rPr>
-          <w:rFonts w:ascii="Arial" w:hAnsi="Arial" w:cs="Arial"/>
-          <w:sz w:val="20"/>
-          <w:szCs w:val="20"/>
-          <w:lang w:eastAsia="en-US"/>
-        </w:rPr>
-        <w:t xml:space="preserve"> </w:t>
-      </w:r>
-      <w:proofErr w:type="spellStart"/>
-      <w:r>
-        <w:rPr>
-          <w:rFonts w:ascii="Arial" w:hAnsi="Arial" w:cs="Arial"/>
-          <w:sz w:val="20"/>
-          <w:szCs w:val="20"/>
-          <w:lang w:eastAsia="en-US"/>
-        </w:rPr>
-        <w:t>to</w:t>
-      </w:r>
-      <w:proofErr w:type="spellEnd"/>
-      <w:r>
-        <w:rPr>
-          <w:rFonts w:ascii="Arial" w:hAnsi="Arial" w:cs="Arial"/>
-          <w:sz w:val="20"/>
-          <w:szCs w:val="20"/>
-          <w:lang w:eastAsia="en-US"/>
-        </w:rPr>
-        <w:t xml:space="preserve"> </w:t>
-      </w:r>
-      <w:proofErr w:type="spellStart"/>
-      <w:r>
-        <w:rPr>
-          <w:rFonts w:ascii="Arial" w:hAnsi="Arial" w:cs="Arial"/>
-          <w:sz w:val="20"/>
-          <w:szCs w:val="20"/>
-          <w:lang w:eastAsia="en-US"/>
-        </w:rPr>
-        <w:t>sequential</w:t>
-      </w:r>
-      <w:proofErr w:type="spellEnd"/>
-      <w:r>
-        <w:rPr>
-          <w:rFonts w:ascii="Arial" w:hAnsi="Arial" w:cs="Arial"/>
-          <w:sz w:val="20"/>
-          <w:szCs w:val="20"/>
-          <w:lang w:eastAsia="en-US"/>
-        </w:rPr>
-        <w:t xml:space="preserve"> modules </w:t>
-      </w:r>
-      <w:proofErr w:type="spellStart"/>
-      <w:r>
-        <w:rPr>
-          <w:rFonts w:ascii="Arial" w:hAnsi="Arial" w:cs="Arial"/>
-          <w:sz w:val="20"/>
-          <w:szCs w:val="20"/>
-          <w:lang w:eastAsia="en-US"/>
-        </w:rPr>
-        <w:t>following</w:t>
-      </w:r>
-      <w:proofErr w:type="spellEnd"/>
-      <w:r>
-        <w:rPr>
-          <w:rFonts w:ascii="Arial" w:hAnsi="Arial" w:cs="Arial"/>
-          <w:sz w:val="20"/>
-          <w:szCs w:val="20"/>
-          <w:lang w:eastAsia="en-US"/>
-        </w:rPr>
-        <w:t xml:space="preserve"> </w:t>
-      </w:r>
-      <w:proofErr w:type="spellStart"/>
-      <w:r>
-        <w:rPr>
-          <w:rFonts w:ascii="Arial" w:hAnsi="Arial" w:cs="Arial"/>
-          <w:sz w:val="20"/>
-          <w:szCs w:val="20"/>
-          <w:lang w:eastAsia="en-US"/>
-        </w:rPr>
-        <w:t>design</w:t>
-      </w:r>
-      <w:proofErr w:type="spellEnd"/>
-      <w:r>
-        <w:rPr>
-          <w:rFonts w:ascii="Arial" w:hAnsi="Arial" w:cs="Arial"/>
-          <w:sz w:val="20"/>
-          <w:szCs w:val="20"/>
-          <w:lang w:eastAsia="en-US"/>
-        </w:rPr>
-        <w:t xml:space="preserve"> standard.</w:t>
+      <w:r>
+        <w:rPr>
+          <w:rFonts w:ascii="Arial" w:hAnsi="Arial" w:cs="Arial"/>
+          <w:sz w:val="20"/>
+          <w:szCs w:val="20"/>
+          <w:lang w:val="en-US" w:eastAsia="en-US"/>
+        </w:rPr>
+        <w:t xml:space="preserve"> and connected to sequential modules following design standard.</w:t>
       </w:r>
     </w:p>
     <w:p>
@@ -805,18 +280,36 @@
           <w:rFonts w:ascii="Arial" w:hAnsi="Arial" w:cs="Arial"/>
           <w:sz w:val="20"/>
           <w:szCs w:val="20"/>
-          <w:lang w:eastAsia="en-US"/>
-        </w:rPr>
-      </w:pPr>
+          <w:lang w:val="en-US" w:eastAsia="en-US"/>
+        </w:rPr>
+      </w:pPr>
+      <w:r>
+        <w:rPr>
+          <w:rFonts w:ascii="Arial" w:hAnsi="Arial" w:cs="Arial"/>
+          <w:sz w:val="20"/>
+          <w:szCs w:val="20"/>
+          <w:lang w:val="en-US" w:eastAsia="en-US"/>
+        </w:rPr>
+        <w:t>All inputs</w:t>
+      </w:r>
+      <w:r>
+        <w:rPr>
+          <w:rFonts w:ascii="Arial" w:hAnsi="Arial" w:cs="Arial"/>
+          <w:sz w:val="20"/>
+          <w:szCs w:val="20"/>
+          <w:lang w:val="en-US" w:eastAsia="en-US"/>
+        </w:rPr>
+        <w:t xml:space="preserve"> (</w:t>
+      </w:r>
       <w:proofErr w:type="spellStart"/>
       <w:r>
         <w:rPr>
           <w:rFonts w:ascii="Arial" w:hAnsi="Arial" w:cs="Arial"/>
           <w:sz w:val="20"/>
           <w:szCs w:val="20"/>
-          <w:lang w:eastAsia="en-US"/>
-        </w:rPr>
-        <w:t>All</w:t>
+          <w:lang w:val="en-US" w:eastAsia="en-US"/>
+        </w:rPr>
+        <w:t>A_in</w:t>
       </w:r>
       <w:proofErr w:type="spellEnd"/>
       <w:r>
@@ -824,18 +317,9 @@
           <w:rFonts w:ascii="Arial" w:hAnsi="Arial" w:cs="Arial"/>
           <w:sz w:val="20"/>
           <w:szCs w:val="20"/>
-          <w:lang w:eastAsia="en-US"/>
-        </w:rPr>
-        <w:t xml:space="preserve"> inputs</w:t>
-      </w:r>
-      <w:r>
-        <w:rPr>
-          <w:rFonts w:ascii="Arial" w:hAnsi="Arial" w:cs="Arial"/>
-          <w:sz w:val="20"/>
-          <w:szCs w:val="20"/>
-          <w:lang w:eastAsia="en-US"/>
-        </w:rPr>
-        <w:t xml:space="preserve"> (</w:t>
+          <w:lang w:val="en-US" w:eastAsia="en-US"/>
+        </w:rPr>
+        <w:t xml:space="preserve">, </w:t>
       </w:r>
       <w:proofErr w:type="spellStart"/>
       <w:r>
@@ -843,9 +327,9 @@
           <w:rFonts w:ascii="Arial" w:hAnsi="Arial" w:cs="Arial"/>
           <w:sz w:val="20"/>
           <w:szCs w:val="20"/>
-          <w:lang w:eastAsia="en-US"/>
-        </w:rPr>
-        <w:t>A_in</w:t>
+          <w:lang w:val="en-US" w:eastAsia="en-US"/>
+        </w:rPr>
+        <w:t>B_in</w:t>
       </w:r>
       <w:proofErr w:type="spellEnd"/>
       <w:r>
@@ -853,47 +337,27 @@
           <w:rFonts w:ascii="Arial" w:hAnsi="Arial" w:cs="Arial"/>
           <w:sz w:val="20"/>
           <w:szCs w:val="20"/>
-          <w:lang w:eastAsia="en-US"/>
-        </w:rPr>
-        <w:t xml:space="preserve">, </w:t>
-      </w:r>
-      <w:proofErr w:type="spellStart"/>
-      <w:r>
-        <w:rPr>
-          <w:rFonts w:ascii="Arial" w:hAnsi="Arial" w:cs="Arial"/>
-          <w:sz w:val="20"/>
-          <w:szCs w:val="20"/>
-          <w:lang w:eastAsia="en-US"/>
-        </w:rPr>
-        <w:t>B_in</w:t>
-      </w:r>
-      <w:proofErr w:type="spellEnd"/>
-      <w:r>
-        <w:rPr>
-          <w:rFonts w:ascii="Arial" w:hAnsi="Arial" w:cs="Arial"/>
-          <w:sz w:val="20"/>
-          <w:szCs w:val="20"/>
-          <w:lang w:eastAsia="en-US"/>
+          <w:lang w:val="en-US" w:eastAsia="en-US"/>
         </w:rPr>
         <w:t xml:space="preserve"> and </w:t>
       </w:r>
-      <w:proofErr w:type="spellStart"/>
-      <w:r>
-        <w:rPr>
-          <w:rFonts w:ascii="Arial" w:hAnsi="Arial" w:cs="Arial"/>
-          <w:sz w:val="20"/>
-          <w:szCs w:val="20"/>
-          <w:lang w:eastAsia="en-US"/>
+      <w:proofErr w:type="gramStart"/>
+      <w:r>
+        <w:rPr>
+          <w:rFonts w:ascii="Arial" w:hAnsi="Arial" w:cs="Arial"/>
+          <w:sz w:val="20"/>
+          <w:szCs w:val="20"/>
+          <w:lang w:val="en-US" w:eastAsia="en-US"/>
         </w:rPr>
         <w:t>Disable</w:t>
       </w:r>
-      <w:proofErr w:type="spellEnd"/>
-      <w:r>
-        <w:rPr>
-          <w:rFonts w:ascii="Arial" w:hAnsi="Arial" w:cs="Arial"/>
-          <w:sz w:val="20"/>
-          <w:szCs w:val="20"/>
-          <w:lang w:eastAsia="en-US"/>
+      <w:proofErr w:type="gramEnd"/>
+      <w:r>
+        <w:rPr>
+          <w:rFonts w:ascii="Arial" w:hAnsi="Arial" w:cs="Arial"/>
+          <w:sz w:val="20"/>
+          <w:szCs w:val="20"/>
+          <w:lang w:val="en-US" w:eastAsia="en-US"/>
         </w:rPr>
         <w:t>)</w:t>
       </w:r>
@@ -902,149 +366,9 @@
           <w:rFonts w:ascii="Arial" w:hAnsi="Arial" w:cs="Arial"/>
           <w:sz w:val="20"/>
           <w:szCs w:val="20"/>
-          <w:lang w:eastAsia="en-US"/>
-        </w:rPr>
-        <w:t xml:space="preserve"> </w:t>
-      </w:r>
-      <w:proofErr w:type="spellStart"/>
-      <w:r>
-        <w:rPr>
-          <w:rFonts w:ascii="Arial" w:hAnsi="Arial" w:cs="Arial"/>
-          <w:sz w:val="20"/>
-          <w:szCs w:val="20"/>
-          <w:lang w:eastAsia="en-US"/>
-        </w:rPr>
-        <w:t>must</w:t>
-      </w:r>
-      <w:proofErr w:type="spellEnd"/>
-      <w:r>
-        <w:rPr>
-          <w:rFonts w:ascii="Arial" w:hAnsi="Arial" w:cs="Arial"/>
-          <w:sz w:val="20"/>
-          <w:szCs w:val="20"/>
-          <w:lang w:eastAsia="en-US"/>
-        </w:rPr>
-        <w:t xml:space="preserve"> be </w:t>
-      </w:r>
-      <w:proofErr w:type="spellStart"/>
-      <w:r>
-        <w:rPr>
-          <w:rFonts w:ascii="Arial" w:hAnsi="Arial" w:cs="Arial"/>
-          <w:sz w:val="20"/>
-          <w:szCs w:val="20"/>
-          <w:lang w:eastAsia="en-US"/>
-        </w:rPr>
-        <w:t>connected</w:t>
-      </w:r>
-      <w:proofErr w:type="spellEnd"/>
-      <w:r>
-        <w:rPr>
-          <w:rFonts w:ascii="Arial" w:hAnsi="Arial" w:cs="Arial"/>
-          <w:sz w:val="20"/>
-          <w:szCs w:val="20"/>
-          <w:lang w:eastAsia="en-US"/>
-        </w:rPr>
-        <w:t xml:space="preserve"> </w:t>
-      </w:r>
-      <w:proofErr w:type="spellStart"/>
-      <w:r>
-        <w:rPr>
-          <w:rFonts w:ascii="Arial" w:hAnsi="Arial" w:cs="Arial"/>
-          <w:sz w:val="20"/>
-          <w:szCs w:val="20"/>
-          <w:lang w:eastAsia="en-US"/>
-        </w:rPr>
-        <w:t>to</w:t>
-      </w:r>
-      <w:proofErr w:type="spellEnd"/>
-      <w:r>
-        <w:rPr>
-          <w:rFonts w:ascii="Arial" w:hAnsi="Arial" w:cs="Arial"/>
-          <w:sz w:val="20"/>
-          <w:szCs w:val="20"/>
-          <w:lang w:eastAsia="en-US"/>
-        </w:rPr>
-        <w:t xml:space="preserve"> </w:t>
-      </w:r>
-      <w:proofErr w:type="spellStart"/>
-      <w:r>
-        <w:rPr>
-          <w:rFonts w:ascii="Arial" w:hAnsi="Arial" w:cs="Arial"/>
-          <w:sz w:val="20"/>
-          <w:szCs w:val="20"/>
-          <w:lang w:eastAsia="en-US"/>
-        </w:rPr>
-        <w:t>either</w:t>
-      </w:r>
-      <w:proofErr w:type="spellEnd"/>
-      <w:r>
-        <w:rPr>
-          <w:rFonts w:ascii="Arial" w:hAnsi="Arial" w:cs="Arial"/>
-          <w:sz w:val="20"/>
-          <w:szCs w:val="20"/>
-          <w:lang w:eastAsia="en-US"/>
-        </w:rPr>
-        <w:t xml:space="preserve"> switches </w:t>
-      </w:r>
-      <w:proofErr w:type="spellStart"/>
-      <w:r>
-        <w:rPr>
-          <w:rFonts w:ascii="Arial" w:hAnsi="Arial" w:cs="Arial"/>
-          <w:sz w:val="20"/>
-          <w:szCs w:val="20"/>
-          <w:lang w:eastAsia="en-US"/>
-        </w:rPr>
-        <w:t>or</w:t>
-      </w:r>
-      <w:proofErr w:type="spellEnd"/>
-      <w:r>
-        <w:rPr>
-          <w:rFonts w:ascii="Arial" w:hAnsi="Arial" w:cs="Arial"/>
-          <w:sz w:val="20"/>
-          <w:szCs w:val="20"/>
-          <w:lang w:eastAsia="en-US"/>
-        </w:rPr>
-        <w:t xml:space="preserve"> </w:t>
-      </w:r>
-      <w:proofErr w:type="spellStart"/>
-      <w:r>
-        <w:rPr>
-          <w:rFonts w:ascii="Arial" w:hAnsi="Arial" w:cs="Arial"/>
-          <w:sz w:val="20"/>
-          <w:szCs w:val="20"/>
-          <w:lang w:eastAsia="en-US"/>
-        </w:rPr>
-        <w:t>push</w:t>
-      </w:r>
-      <w:proofErr w:type="spellEnd"/>
-      <w:r>
-        <w:rPr>
-          <w:rFonts w:ascii="Arial" w:hAnsi="Arial" w:cs="Arial"/>
-          <w:sz w:val="20"/>
-          <w:szCs w:val="20"/>
-          <w:lang w:eastAsia="en-US"/>
-        </w:rPr>
-        <w:t xml:space="preserve"> </w:t>
-      </w:r>
-      <w:proofErr w:type="spellStart"/>
-      <w:r>
-        <w:rPr>
-          <w:rFonts w:ascii="Arial" w:hAnsi="Arial" w:cs="Arial"/>
-          <w:sz w:val="20"/>
-          <w:szCs w:val="20"/>
-          <w:lang w:eastAsia="en-US"/>
-        </w:rPr>
-        <w:t>buttons</w:t>
-      </w:r>
-      <w:proofErr w:type="spellEnd"/>
-      <w:r>
-        <w:rPr>
-          <w:rFonts w:ascii="Arial" w:hAnsi="Arial" w:cs="Arial"/>
-          <w:sz w:val="20"/>
-          <w:szCs w:val="20"/>
-          <w:lang w:eastAsia="en-US"/>
-        </w:rPr>
-        <w:t>.</w:t>
+          <w:lang w:val="en-US" w:eastAsia="en-US"/>
+        </w:rPr>
+        <w:t xml:space="preserve"> must be connected to either switches or push buttons.</w:t>
       </w:r>
     </w:p>
     <w:p>
@@ -1058,108 +382,17 @@
           <w:rFonts w:ascii="Arial" w:hAnsi="Arial" w:cs="Arial"/>
           <w:sz w:val="20"/>
           <w:szCs w:val="20"/>
-          <w:lang w:eastAsia="en-US"/>
-        </w:rPr>
-      </w:pPr>
-      <w:proofErr w:type="spellStart"/>
-      <w:r>
-        <w:rPr>
-          <w:rFonts w:ascii="Arial" w:hAnsi="Arial" w:cs="Arial"/>
-          <w:sz w:val="20"/>
-          <w:szCs w:val="20"/>
-          <w:lang w:eastAsia="en-US"/>
-        </w:rPr>
-        <w:t>All</w:t>
-      </w:r>
-      <w:proofErr w:type="spellEnd"/>
-      <w:r>
-        <w:rPr>
-          <w:rFonts w:ascii="Arial" w:hAnsi="Arial" w:cs="Arial"/>
-          <w:sz w:val="20"/>
-          <w:szCs w:val="20"/>
-          <w:lang w:eastAsia="en-US"/>
-        </w:rPr>
-        <w:t xml:space="preserve"> outputs </w:t>
-      </w:r>
-      <w:proofErr w:type="spellStart"/>
-      <w:r>
-        <w:rPr>
-          <w:rFonts w:ascii="Arial" w:hAnsi="Arial" w:cs="Arial"/>
-          <w:sz w:val="20"/>
-          <w:szCs w:val="20"/>
-          <w:lang w:eastAsia="en-US"/>
-        </w:rPr>
-        <w:t>must</w:t>
-      </w:r>
-      <w:proofErr w:type="spellEnd"/>
-      <w:r>
-        <w:rPr>
-          <w:rFonts w:ascii="Arial" w:hAnsi="Arial" w:cs="Arial"/>
-          <w:sz w:val="20"/>
-          <w:szCs w:val="20"/>
-          <w:lang w:eastAsia="en-US"/>
-        </w:rPr>
-        <w:t xml:space="preserve"> be </w:t>
-      </w:r>
-      <w:proofErr w:type="spellStart"/>
-      <w:r>
-        <w:rPr>
-          <w:rFonts w:ascii="Arial" w:hAnsi="Arial" w:cs="Arial"/>
-          <w:sz w:val="20"/>
-          <w:szCs w:val="20"/>
-          <w:lang w:eastAsia="en-US"/>
-        </w:rPr>
-        <w:t>connected</w:t>
-      </w:r>
-      <w:proofErr w:type="spellEnd"/>
-      <w:r>
-        <w:rPr>
-          <w:rFonts w:ascii="Arial" w:hAnsi="Arial" w:cs="Arial"/>
-          <w:sz w:val="20"/>
-          <w:szCs w:val="20"/>
-          <w:lang w:eastAsia="en-US"/>
-        </w:rPr>
-        <w:t xml:space="preserve"> </w:t>
-      </w:r>
-      <w:proofErr w:type="spellStart"/>
-      <w:r>
-        <w:rPr>
-          <w:rFonts w:ascii="Arial" w:hAnsi="Arial" w:cs="Arial"/>
-          <w:sz w:val="20"/>
-          <w:szCs w:val="20"/>
-          <w:lang w:eastAsia="en-US"/>
-        </w:rPr>
-        <w:t>to</w:t>
-      </w:r>
-      <w:proofErr w:type="spellEnd"/>
-      <w:r>
-        <w:rPr>
-          <w:rFonts w:ascii="Arial" w:hAnsi="Arial" w:cs="Arial"/>
-          <w:sz w:val="20"/>
-          <w:szCs w:val="20"/>
-          <w:lang w:eastAsia="en-US"/>
-        </w:rPr>
-        <w:t xml:space="preserve"> </w:t>
-      </w:r>
-      <w:proofErr w:type="spellStart"/>
-      <w:r>
-        <w:rPr>
-          <w:rFonts w:ascii="Arial" w:hAnsi="Arial" w:cs="Arial"/>
-          <w:sz w:val="20"/>
-          <w:szCs w:val="20"/>
-          <w:lang w:eastAsia="en-US"/>
-        </w:rPr>
-        <w:t>LEDs</w:t>
-      </w:r>
-      <w:proofErr w:type="spellEnd"/>
-      <w:r>
-        <w:rPr>
-          <w:rFonts w:ascii="Arial" w:hAnsi="Arial" w:cs="Arial"/>
-          <w:sz w:val="20"/>
-          <w:szCs w:val="20"/>
-          <w:lang w:eastAsia="en-US"/>
-        </w:rPr>
-        <w:t>.</w:t>
+          <w:lang w:val="en-US" w:eastAsia="en-US"/>
+        </w:rPr>
+      </w:pPr>
+      <w:r>
+        <w:rPr>
+          <w:rFonts w:ascii="Arial" w:hAnsi="Arial" w:cs="Arial"/>
+          <w:sz w:val="20"/>
+          <w:szCs w:val="20"/>
+          <w:lang w:val="en-US" w:eastAsia="en-US"/>
+        </w:rPr>
+        <w:t>All outputs must be connected to LEDs.</w:t>
       </w:r>
     </w:p>
     <w:p>
@@ -1169,7 +402,7 @@
           <w:rFonts w:ascii="Arial" w:hAnsi="Arial" w:cs="Arial"/>
           <w:sz w:val="20"/>
           <w:szCs w:val="20"/>
-          <w:lang w:eastAsia="en-US"/>
+          <w:lang w:val="en-US" w:eastAsia="en-US"/>
         </w:rPr>
       </w:pPr>
     </w:p>
@@ -1186,12 +419,13 @@
       <w:r>
         <w:rPr>
           <w:rFonts w:ascii="Arial" w:hAnsi="Arial" w:cs="Arial"/>
+          <w:noProof/>
           <w:sz w:val="20"/>
           <w:szCs w:val="20"/>
           <w:lang w:val="en-US" w:eastAsia="en-US"/>
         </w:rPr>
         <w:drawing>
-          <wp:inline distT="0" distB="0" distL="0" distR="0" wp14:anchorId="5BAE14D2" wp14:editId="639B2F28">
+          <wp:inline distT="0" distB="0" distL="0" distR="0" wp14:anchorId="5BAE14D2" wp14:editId="4122E052">
             <wp:extent cx="6591300" cy="3086100"/>
             <wp:effectExtent l="0" t="0" r="0" b="0"/>
             <wp:docPr id="2088760821" name="Picture 5"/>
@@ -1430,7 +664,7 @@
           <w:rFonts w:ascii="Arial" w:hAnsi="Arial" w:cs="Arial"/>
           <w:sz w:val="20"/>
           <w:szCs w:val="20"/>
-          <w:lang w:eastAsia="en-US"/>
+          <w:lang w:val="en-US" w:eastAsia="en-US"/>
         </w:rPr>
       </w:pPr>
       <w:r>
@@ -1440,136 +674,16 @@
           <w:iCs/>
           <w:sz w:val="20"/>
           <w:szCs w:val="20"/>
-          <w:lang w:eastAsia="en-US"/>
-        </w:rPr>
-        <w:t xml:space="preserve">Picture 2. </w:t>
-      </w:r>
-      <w:proofErr w:type="spellStart"/>
-      <w:r>
-        <w:rPr>
-          <w:rFonts w:ascii="Arial" w:hAnsi="Arial" w:cs="Arial"/>
-          <w:i/>
-          <w:iCs/>
-          <w:sz w:val="20"/>
-          <w:szCs w:val="20"/>
-          <w:lang w:eastAsia="en-US"/>
-        </w:rPr>
-        <w:t>Translating</w:t>
-      </w:r>
-      <w:proofErr w:type="spellEnd"/>
-      <w:r>
-        <w:rPr>
-          <w:rFonts w:ascii="Arial" w:hAnsi="Arial" w:cs="Arial"/>
-          <w:i/>
-          <w:iCs/>
-          <w:sz w:val="20"/>
-          <w:szCs w:val="20"/>
-          <w:lang w:eastAsia="en-US"/>
-        </w:rPr>
-        <w:t xml:space="preserve"> </w:t>
-      </w:r>
-      <w:proofErr w:type="spellStart"/>
-      <w:r>
-        <w:rPr>
-          <w:rFonts w:ascii="Arial" w:hAnsi="Arial" w:cs="Arial"/>
-          <w:i/>
-          <w:iCs/>
-          <w:sz w:val="20"/>
-          <w:szCs w:val="20"/>
-          <w:lang w:eastAsia="en-US"/>
-        </w:rPr>
-        <w:t>student</w:t>
-      </w:r>
-      <w:r>
-        <w:rPr>
-          <w:rFonts w:ascii="Arial" w:hAnsi="Arial" w:cs="Arial"/>
-          <w:i/>
-          <w:iCs/>
-          <w:sz w:val="20"/>
-          <w:szCs w:val="20"/>
-          <w:lang w:eastAsia="en-US"/>
-        </w:rPr>
-        <w:t>’s</w:t>
-      </w:r>
-      <w:proofErr w:type="spellEnd"/>
-      <w:r>
-        <w:rPr>
-          <w:rFonts w:ascii="Arial" w:hAnsi="Arial" w:cs="Arial"/>
-          <w:i/>
-          <w:iCs/>
-          <w:sz w:val="20"/>
-          <w:szCs w:val="20"/>
-          <w:lang w:eastAsia="en-US"/>
-        </w:rPr>
-        <w:t xml:space="preserve"> </w:t>
-      </w:r>
-      <w:proofErr w:type="spellStart"/>
-      <w:r>
-        <w:rPr>
-          <w:rFonts w:ascii="Arial" w:hAnsi="Arial" w:cs="Arial"/>
-          <w:i/>
-          <w:iCs/>
-          <w:sz w:val="20"/>
-          <w:szCs w:val="20"/>
-          <w:lang w:eastAsia="en-US"/>
-        </w:rPr>
-        <w:t>number</w:t>
-      </w:r>
-      <w:proofErr w:type="spellEnd"/>
-      <w:r>
-        <w:rPr>
-          <w:rFonts w:ascii="Arial" w:hAnsi="Arial" w:cs="Arial"/>
-          <w:i/>
-          <w:iCs/>
-          <w:sz w:val="20"/>
-          <w:szCs w:val="20"/>
-          <w:lang w:eastAsia="en-US"/>
-        </w:rPr>
-        <w:t xml:space="preserve"> </w:t>
-      </w:r>
-      <w:proofErr w:type="spellStart"/>
-      <w:r>
-        <w:rPr>
-          <w:rFonts w:ascii="Arial" w:hAnsi="Arial" w:cs="Arial"/>
-          <w:i/>
-          <w:iCs/>
-          <w:sz w:val="20"/>
-          <w:szCs w:val="20"/>
-          <w:lang w:eastAsia="en-US"/>
-        </w:rPr>
-        <w:t>to</w:t>
-      </w:r>
-      <w:proofErr w:type="spellEnd"/>
-      <w:r>
-        <w:rPr>
-          <w:rFonts w:ascii="Arial" w:hAnsi="Arial" w:cs="Arial"/>
-          <w:i/>
-          <w:iCs/>
-          <w:sz w:val="20"/>
-          <w:szCs w:val="20"/>
-          <w:lang w:eastAsia="en-US"/>
-        </w:rPr>
-        <w:t xml:space="preserve"> </w:t>
-      </w:r>
-      <w:proofErr w:type="spellStart"/>
-      <w:r>
-        <w:rPr>
-          <w:rFonts w:ascii="Arial" w:hAnsi="Arial" w:cs="Arial"/>
-          <w:i/>
-          <w:iCs/>
-          <w:sz w:val="20"/>
-          <w:szCs w:val="20"/>
-          <w:lang w:eastAsia="en-US"/>
-        </w:rPr>
-        <w:t>binary</w:t>
-      </w:r>
-      <w:proofErr w:type="spellEnd"/>
-      <w:r>
-        <w:rPr>
-          <w:rFonts w:ascii="Arial" w:hAnsi="Arial" w:cs="Arial"/>
-          <w:sz w:val="20"/>
-          <w:szCs w:val="20"/>
-          <w:lang w:eastAsia="en-US"/>
+          <w:lang w:val="en-US" w:eastAsia="en-US"/>
+        </w:rPr>
+        <w:t>Picture 2. Translating student’s number to binary</w:t>
+      </w:r>
+      <w:r>
+        <w:rPr>
+          <w:rFonts w:ascii="Arial" w:hAnsi="Arial" w:cs="Arial"/>
+          <w:sz w:val="20"/>
+          <w:szCs w:val="20"/>
+          <w:lang w:val="en-US" w:eastAsia="en-US"/>
         </w:rPr>
         <w:t>.</w:t>
       </w:r>
@@ -1580,7 +694,7 @@
           <w:rFonts w:ascii="Arial" w:hAnsi="Arial" w:cs="Arial"/>
           <w:sz w:val="20"/>
           <w:szCs w:val="20"/>
-          <w:lang w:eastAsia="en-US"/>
+          <w:lang w:val="en-US" w:eastAsia="en-US"/>
         </w:rPr>
       </w:pPr>
     </w:p>
@@ -1590,394 +704,9 @@
           <w:rFonts w:ascii="Arial" w:hAnsi="Arial" w:cs="Arial"/>
           <w:sz w:val="20"/>
           <w:szCs w:val="20"/>
-          <w:lang w:eastAsia="en-US"/>
-        </w:rPr>
-      </w:pPr>
-      <w:proofErr w:type="spellStart"/>
-      <w:r>
-        <w:rPr>
-          <w:rFonts w:ascii="Arial" w:hAnsi="Arial" w:cs="Arial"/>
-          <w:sz w:val="20"/>
-          <w:szCs w:val="20"/>
-          <w:lang w:eastAsia="en-US"/>
-        </w:rPr>
-        <w:t>Using</w:t>
-      </w:r>
-      <w:proofErr w:type="spellEnd"/>
-      <w:r>
-        <w:rPr>
-          <w:rFonts w:ascii="Arial" w:hAnsi="Arial" w:cs="Arial"/>
-          <w:sz w:val="20"/>
-          <w:szCs w:val="20"/>
-          <w:lang w:eastAsia="en-US"/>
-        </w:rPr>
-        <w:t xml:space="preserve"> </w:t>
-      </w:r>
-      <w:proofErr w:type="spellStart"/>
-      <w:r>
-        <w:rPr>
-          <w:rFonts w:ascii="Arial" w:hAnsi="Arial" w:cs="Arial"/>
-          <w:sz w:val="20"/>
-          <w:szCs w:val="20"/>
-          <w:lang w:eastAsia="en-US"/>
-        </w:rPr>
-        <w:t>the</w:t>
-      </w:r>
-      <w:proofErr w:type="spellEnd"/>
-      <w:r>
-        <w:rPr>
-          <w:rFonts w:ascii="Arial" w:hAnsi="Arial" w:cs="Arial"/>
-          <w:sz w:val="20"/>
-          <w:szCs w:val="20"/>
-          <w:lang w:eastAsia="en-US"/>
-        </w:rPr>
-        <w:t xml:space="preserve"> </w:t>
-      </w:r>
-      <w:proofErr w:type="spellStart"/>
-      <w:r>
-        <w:rPr>
-          <w:rFonts w:ascii="Arial" w:hAnsi="Arial" w:cs="Arial"/>
-          <w:sz w:val="20"/>
-          <w:szCs w:val="20"/>
-          <w:lang w:eastAsia="en-US"/>
-        </w:rPr>
-        <w:t>binary</w:t>
-      </w:r>
-      <w:proofErr w:type="spellEnd"/>
-      <w:r>
-        <w:rPr>
-          <w:rFonts w:ascii="Arial" w:hAnsi="Arial" w:cs="Arial"/>
-          <w:sz w:val="20"/>
-          <w:szCs w:val="20"/>
-          <w:lang w:eastAsia="en-US"/>
-        </w:rPr>
-        <w:t xml:space="preserve"> </w:t>
-      </w:r>
-      <w:proofErr w:type="spellStart"/>
-      <w:r>
-        <w:rPr>
-          <w:rFonts w:ascii="Arial" w:hAnsi="Arial" w:cs="Arial"/>
-          <w:sz w:val="20"/>
-          <w:szCs w:val="20"/>
-          <w:lang w:eastAsia="en-US"/>
-        </w:rPr>
-        <w:t>value</w:t>
-      </w:r>
-      <w:proofErr w:type="spellEnd"/>
-      <w:r>
-        <w:rPr>
-          <w:rFonts w:ascii="Arial" w:hAnsi="Arial" w:cs="Arial"/>
-          <w:sz w:val="20"/>
-          <w:szCs w:val="20"/>
-          <w:lang w:eastAsia="en-US"/>
-        </w:rPr>
-        <w:t xml:space="preserve"> </w:t>
-      </w:r>
-      <w:proofErr w:type="spellStart"/>
-      <w:r>
-        <w:rPr>
-          <w:rFonts w:ascii="Arial" w:hAnsi="Arial" w:cs="Arial"/>
-          <w:sz w:val="20"/>
-          <w:szCs w:val="20"/>
-          <w:lang w:eastAsia="en-US"/>
-        </w:rPr>
-        <w:t>of</w:t>
-      </w:r>
-      <w:proofErr w:type="spellEnd"/>
-      <w:r>
-        <w:rPr>
-          <w:rFonts w:ascii="Arial" w:hAnsi="Arial" w:cs="Arial"/>
-          <w:sz w:val="20"/>
-          <w:szCs w:val="20"/>
-          <w:lang w:eastAsia="en-US"/>
-        </w:rPr>
-        <w:t xml:space="preserve"> </w:t>
-      </w:r>
-      <w:proofErr w:type="spellStart"/>
-      <w:r>
-        <w:rPr>
-          <w:rFonts w:ascii="Arial" w:hAnsi="Arial" w:cs="Arial"/>
-          <w:sz w:val="20"/>
-          <w:szCs w:val="20"/>
-          <w:lang w:eastAsia="en-US"/>
-        </w:rPr>
-        <w:t>your</w:t>
-      </w:r>
-      <w:proofErr w:type="spellEnd"/>
-      <w:r>
-        <w:rPr>
-          <w:rFonts w:ascii="Arial" w:hAnsi="Arial" w:cs="Arial"/>
-          <w:sz w:val="20"/>
-          <w:szCs w:val="20"/>
-          <w:lang w:eastAsia="en-US"/>
-        </w:rPr>
-        <w:t xml:space="preserve"> </w:t>
-      </w:r>
-      <w:proofErr w:type="spellStart"/>
-      <w:r>
-        <w:rPr>
-          <w:rFonts w:ascii="Arial" w:hAnsi="Arial" w:cs="Arial"/>
-          <w:sz w:val="20"/>
-          <w:szCs w:val="20"/>
-          <w:lang w:eastAsia="en-US"/>
-        </w:rPr>
-        <w:t>student’s</w:t>
-      </w:r>
-      <w:proofErr w:type="spellEnd"/>
-      <w:r>
-        <w:rPr>
-          <w:rFonts w:ascii="Arial" w:hAnsi="Arial" w:cs="Arial"/>
-          <w:sz w:val="20"/>
-          <w:szCs w:val="20"/>
-          <w:lang w:eastAsia="en-US"/>
-        </w:rPr>
-        <w:t xml:space="preserve"> </w:t>
-      </w:r>
-      <w:proofErr w:type="spellStart"/>
-      <w:r>
-        <w:rPr>
-          <w:rFonts w:ascii="Arial" w:hAnsi="Arial" w:cs="Arial"/>
-          <w:sz w:val="20"/>
-          <w:szCs w:val="20"/>
-          <w:lang w:eastAsia="en-US"/>
-        </w:rPr>
-        <w:t>number</w:t>
-      </w:r>
-      <w:proofErr w:type="spellEnd"/>
-      <w:r>
-        <w:rPr>
-          <w:rFonts w:ascii="Arial" w:hAnsi="Arial" w:cs="Arial"/>
-          <w:sz w:val="20"/>
-          <w:szCs w:val="20"/>
-          <w:lang w:eastAsia="en-US"/>
-        </w:rPr>
-        <w:t xml:space="preserve"> </w:t>
-      </w:r>
-      <w:proofErr w:type="spellStart"/>
-      <w:r>
-        <w:rPr>
-          <w:rFonts w:ascii="Arial" w:hAnsi="Arial" w:cs="Arial"/>
-          <w:sz w:val="20"/>
-          <w:szCs w:val="20"/>
-          <w:lang w:eastAsia="en-US"/>
-        </w:rPr>
-        <w:t>follow</w:t>
-      </w:r>
-      <w:proofErr w:type="spellEnd"/>
-      <w:r>
-        <w:rPr>
-          <w:rFonts w:ascii="Arial" w:hAnsi="Arial" w:cs="Arial"/>
-          <w:sz w:val="20"/>
-          <w:szCs w:val="20"/>
-          <w:lang w:eastAsia="en-US"/>
-        </w:rPr>
-        <w:t xml:space="preserve"> and </w:t>
-      </w:r>
-      <w:proofErr w:type="spellStart"/>
-      <w:r>
-        <w:rPr>
-          <w:rFonts w:ascii="Arial" w:hAnsi="Arial" w:cs="Arial"/>
-          <w:sz w:val="20"/>
-          <w:szCs w:val="20"/>
-          <w:lang w:eastAsia="en-US"/>
-        </w:rPr>
-        <w:t>fill</w:t>
-      </w:r>
-      <w:proofErr w:type="spellEnd"/>
-      <w:r>
-        <w:rPr>
-          <w:rFonts w:ascii="Arial" w:hAnsi="Arial" w:cs="Arial"/>
-          <w:sz w:val="20"/>
-          <w:szCs w:val="20"/>
-          <w:lang w:eastAsia="en-US"/>
-        </w:rPr>
-        <w:t xml:space="preserve"> t</w:t>
-      </w:r>
-      <w:r>
-        <w:rPr>
-          <w:rFonts w:ascii="Arial" w:hAnsi="Arial" w:cs="Arial"/>
-          <w:sz w:val="20"/>
-          <w:szCs w:val="20"/>
-          <w:lang w:eastAsia="en-US"/>
-        </w:rPr>
-        <w:t>able 1</w:t>
-      </w:r>
-      <w:r>
-        <w:rPr>
-          <w:rFonts w:ascii="Arial" w:hAnsi="Arial" w:cs="Arial"/>
-          <w:sz w:val="20"/>
-          <w:szCs w:val="20"/>
-          <w:lang w:eastAsia="en-US"/>
-        </w:rPr>
-        <w:t xml:space="preserve"> </w:t>
-      </w:r>
-      <w:proofErr w:type="spellStart"/>
-      <w:r>
-        <w:rPr>
-          <w:rFonts w:ascii="Arial" w:hAnsi="Arial" w:cs="Arial"/>
-          <w:sz w:val="20"/>
-          <w:szCs w:val="20"/>
-          <w:lang w:eastAsia="en-US"/>
-        </w:rPr>
-        <w:t>to</w:t>
-      </w:r>
-      <w:proofErr w:type="spellEnd"/>
-      <w:r>
-        <w:rPr>
-          <w:rFonts w:ascii="Arial" w:hAnsi="Arial" w:cs="Arial"/>
-          <w:sz w:val="20"/>
-          <w:szCs w:val="20"/>
-          <w:lang w:eastAsia="en-US"/>
-        </w:rPr>
-        <w:t xml:space="preserve"> do </w:t>
-      </w:r>
-      <w:r>
-        <w:rPr>
-          <w:rFonts w:ascii="Arial" w:hAnsi="Arial" w:cs="Arial"/>
-          <w:sz w:val="20"/>
-          <w:szCs w:val="20"/>
-          <w:lang w:eastAsia="en-US"/>
-        </w:rPr>
-        <w:t>8</w:t>
-      </w:r>
-      <w:r>
-        <w:rPr>
-          <w:rFonts w:ascii="Arial" w:hAnsi="Arial" w:cs="Arial"/>
-          <w:sz w:val="20"/>
-          <w:szCs w:val="20"/>
-          <w:lang w:eastAsia="en-US"/>
-        </w:rPr>
-        <w:t xml:space="preserve"> </w:t>
-      </w:r>
-      <w:proofErr w:type="spellStart"/>
-      <w:r>
-        <w:rPr>
-          <w:rFonts w:ascii="Arial" w:hAnsi="Arial" w:cs="Arial"/>
-          <w:sz w:val="20"/>
-          <w:szCs w:val="20"/>
-          <w:lang w:eastAsia="en-US"/>
-        </w:rPr>
-        <w:t>tests</w:t>
-      </w:r>
-      <w:proofErr w:type="spellEnd"/>
-      <w:r>
-        <w:rPr>
-          <w:rFonts w:ascii="Arial" w:hAnsi="Arial" w:cs="Arial"/>
-          <w:sz w:val="20"/>
-          <w:szCs w:val="20"/>
-          <w:lang w:eastAsia="en-US"/>
-        </w:rPr>
-        <w:t xml:space="preserve"> (use </w:t>
-      </w:r>
-      <w:proofErr w:type="spellStart"/>
-      <w:r>
-        <w:rPr>
-          <w:rFonts w:ascii="Arial" w:hAnsi="Arial" w:cs="Arial"/>
-          <w:sz w:val="20"/>
-          <w:szCs w:val="20"/>
-          <w:lang w:eastAsia="en-US"/>
-        </w:rPr>
-        <w:t>proper</w:t>
-      </w:r>
-      <w:proofErr w:type="spellEnd"/>
-      <w:r>
-        <w:rPr>
-          <w:rFonts w:ascii="Arial" w:hAnsi="Arial" w:cs="Arial"/>
-          <w:sz w:val="20"/>
-          <w:szCs w:val="20"/>
-          <w:lang w:eastAsia="en-US"/>
-        </w:rPr>
-        <w:t xml:space="preserve"> </w:t>
-      </w:r>
-      <w:proofErr w:type="spellStart"/>
-      <w:r>
-        <w:rPr>
-          <w:rFonts w:ascii="Arial" w:hAnsi="Arial" w:cs="Arial"/>
-          <w:sz w:val="20"/>
-          <w:szCs w:val="20"/>
-          <w:lang w:eastAsia="en-US"/>
-        </w:rPr>
-        <w:t>values</w:t>
-      </w:r>
-      <w:proofErr w:type="spellEnd"/>
-      <w:r>
-        <w:rPr>
-          <w:rFonts w:ascii="Arial" w:hAnsi="Arial" w:cs="Arial"/>
-          <w:sz w:val="20"/>
-          <w:szCs w:val="20"/>
-          <w:lang w:eastAsia="en-US"/>
-        </w:rPr>
-        <w:t xml:space="preserve">, </w:t>
-      </w:r>
-      <w:proofErr w:type="spellStart"/>
-      <w:r>
-        <w:rPr>
-          <w:rFonts w:ascii="Arial" w:hAnsi="Arial" w:cs="Arial"/>
-          <w:sz w:val="20"/>
-          <w:szCs w:val="20"/>
-          <w:lang w:eastAsia="en-US"/>
-        </w:rPr>
-        <w:t>not</w:t>
-      </w:r>
-      <w:proofErr w:type="spellEnd"/>
-      <w:r>
-        <w:rPr>
-          <w:rFonts w:ascii="Arial" w:hAnsi="Arial" w:cs="Arial"/>
-          <w:sz w:val="20"/>
-          <w:szCs w:val="20"/>
-          <w:lang w:eastAsia="en-US"/>
-        </w:rPr>
-        <w:t xml:space="preserve"> </w:t>
-      </w:r>
-      <w:proofErr w:type="spellStart"/>
-      <w:r>
-        <w:rPr>
-          <w:rFonts w:ascii="Arial" w:hAnsi="Arial" w:cs="Arial"/>
-          <w:sz w:val="20"/>
-          <w:szCs w:val="20"/>
-          <w:lang w:eastAsia="en-US"/>
-        </w:rPr>
-        <w:t>e.g</w:t>
-      </w:r>
-      <w:proofErr w:type="spellEnd"/>
-      <w:r>
-        <w:rPr>
-          <w:rFonts w:ascii="Arial" w:hAnsi="Arial" w:cs="Arial"/>
-          <w:sz w:val="20"/>
-          <w:szCs w:val="20"/>
-          <w:lang w:eastAsia="en-US"/>
-        </w:rPr>
-        <w:t xml:space="preserve">. </w:t>
-      </w:r>
-      <w:proofErr w:type="spellStart"/>
-      <w:r>
-        <w:rPr>
-          <w:rFonts w:ascii="Arial" w:hAnsi="Arial" w:cs="Arial"/>
-          <w:sz w:val="20"/>
-          <w:szCs w:val="20"/>
-          <w:lang w:eastAsia="en-US"/>
-        </w:rPr>
-        <w:t>values</w:t>
-      </w:r>
-      <w:proofErr w:type="spellEnd"/>
-      <w:r>
-        <w:rPr>
-          <w:rFonts w:ascii="Arial" w:hAnsi="Arial" w:cs="Arial"/>
-          <w:sz w:val="20"/>
-          <w:szCs w:val="20"/>
-          <w:lang w:eastAsia="en-US"/>
-        </w:rPr>
-        <w:t>)</w:t>
-      </w:r>
-      <w:r>
-        <w:rPr>
-          <w:rFonts w:ascii="Arial" w:hAnsi="Arial" w:cs="Arial"/>
-          <w:sz w:val="20"/>
-          <w:szCs w:val="20"/>
-          <w:lang w:eastAsia="en-US"/>
-        </w:rPr>
-        <w:t>:</w:t>
-      </w:r>
+          <w:lang w:val="en-US" w:eastAsia="en-US"/>
+        </w:rPr>
+      </w:pPr>
     </w:p>
     <w:p>
       <w:pPr>
@@ -1985,7 +714,109 @@
           <w:rFonts w:ascii="Arial" w:hAnsi="Arial" w:cs="Arial"/>
           <w:sz w:val="20"/>
           <w:szCs w:val="20"/>
-          <w:lang w:eastAsia="en-US"/>
+          <w:lang w:val="en-US" w:eastAsia="en-US"/>
+        </w:rPr>
+      </w:pPr>
+      <w:r>
+        <w:rPr>
+          <w:rFonts w:ascii="Arial" w:hAnsi="Arial" w:cs="Arial"/>
+          <w:sz w:val="20"/>
+          <w:szCs w:val="20"/>
+          <w:lang w:val="en-US" w:eastAsia="en-US"/>
+        </w:rPr>
+        <w:lastRenderedPageBreak/>
+        <w:t>Using the binary value of your student’s number follow</w:t>
+      </w:r>
+      <w:r>
+        <w:rPr>
+          <w:rFonts w:ascii="Arial" w:hAnsi="Arial" w:cs="Arial"/>
+          <w:sz w:val="20"/>
+          <w:szCs w:val="20"/>
+          <w:lang w:val="en-US" w:eastAsia="en-US"/>
+        </w:rPr>
+        <w:t xml:space="preserve"> and fill</w:t>
+      </w:r>
+      <w:r>
+        <w:rPr>
+          <w:rFonts w:ascii="Arial" w:hAnsi="Arial" w:cs="Arial"/>
+          <w:sz w:val="20"/>
+          <w:szCs w:val="20"/>
+          <w:lang w:val="en-US" w:eastAsia="en-US"/>
+        </w:rPr>
+        <w:t xml:space="preserve"> t</w:t>
+      </w:r>
+      <w:r>
+        <w:rPr>
+          <w:rFonts w:ascii="Arial" w:hAnsi="Arial" w:cs="Arial"/>
+          <w:sz w:val="20"/>
+          <w:szCs w:val="20"/>
+          <w:lang w:val="en-US" w:eastAsia="en-US"/>
+        </w:rPr>
+        <w:t>able 1</w:t>
+      </w:r>
+      <w:r>
+        <w:rPr>
+          <w:rFonts w:ascii="Arial" w:hAnsi="Arial" w:cs="Arial"/>
+          <w:sz w:val="20"/>
+          <w:szCs w:val="20"/>
+          <w:lang w:val="en-US" w:eastAsia="en-US"/>
+        </w:rPr>
+        <w:t xml:space="preserve"> to do </w:t>
+      </w:r>
+      <w:r>
+        <w:rPr>
+          <w:rFonts w:ascii="Arial" w:hAnsi="Arial" w:cs="Arial"/>
+          <w:sz w:val="20"/>
+          <w:szCs w:val="20"/>
+          <w:lang w:val="en-US" w:eastAsia="en-US"/>
+        </w:rPr>
+        <w:t>8</w:t>
+      </w:r>
+      <w:r>
+        <w:rPr>
+          <w:rFonts w:ascii="Arial" w:hAnsi="Arial" w:cs="Arial"/>
+          <w:sz w:val="20"/>
+          <w:szCs w:val="20"/>
+          <w:lang w:val="en-US" w:eastAsia="en-US"/>
+        </w:rPr>
+        <w:t xml:space="preserve"> tests</w:t>
+      </w:r>
+      <w:r>
+        <w:rPr>
+          <w:rFonts w:ascii="Arial" w:hAnsi="Arial" w:cs="Arial"/>
+          <w:sz w:val="20"/>
+          <w:szCs w:val="20"/>
+          <w:lang w:val="en-US" w:eastAsia="en-US"/>
+        </w:rPr>
+        <w:t xml:space="preserve"> (use proper values, not e.g. values)</w:t>
+      </w:r>
+      <w:r>
+        <w:rPr>
+          <w:rFonts w:ascii="Arial" w:hAnsi="Arial" w:cs="Arial"/>
+          <w:sz w:val="20"/>
+          <w:szCs w:val="20"/>
+          <w:lang w:val="en-US" w:eastAsia="en-US"/>
+        </w:rPr>
+        <w:t>:</w:t>
+      </w:r>
+    </w:p>
+    <w:p>
+      <w:pPr>
+        <w:rPr>
+          <w:rFonts w:ascii="Arial" w:hAnsi="Arial" w:cs="Arial"/>
+          <w:sz w:val="20"/>
+          <w:szCs w:val="20"/>
+          <w:lang w:val="en-US" w:eastAsia="en-US"/>
+        </w:rPr>
+      </w:pPr>
+    </w:p>
+    <w:p>
+      <w:pPr>
+        <w:rPr>
+          <w:rFonts w:ascii="Arial" w:hAnsi="Arial" w:cs="Arial"/>
+          <w:sz w:val="20"/>
+          <w:szCs w:val="20"/>
+          <w:lang w:val="en-US" w:eastAsia="en-US"/>
         </w:rPr>
       </w:pPr>
     </w:p>
@@ -2314,6 +1145,13 @@
                 <w:szCs w:val="20"/>
               </w:rPr>
             </w:pPr>
+            <w:r>
+              <w:rPr>
+                <w:sz w:val="20"/>
+                <w:szCs w:val="20"/>
+              </w:rPr>
+              <w:t>0000*0000=0000</w:t>
+            </w:r>
           </w:p>
         </w:tc>
         <w:tc>
@@ -2530,6 +1368,13 @@
                 <w:szCs w:val="20"/>
               </w:rPr>
             </w:pPr>
+            <w:r>
+              <w:rPr>
+                <w:sz w:val="20"/>
+                <w:szCs w:val="20"/>
+              </w:rPr>
+              <w:t>-0010=1110</w:t>
+            </w:r>
           </w:p>
         </w:tc>
         <w:tc>
@@ -2704,6 +1549,13 @@
                 <w:szCs w:val="20"/>
               </w:rPr>
             </w:pPr>
+            <w:r>
+              <w:rPr>
+                <w:sz w:val="20"/>
+                <w:szCs w:val="20"/>
+              </w:rPr>
+              <w:t>1011-0000=1011</w:t>
+            </w:r>
           </w:p>
         </w:tc>
         <w:tc>
@@ -2878,6 +1730,13 @@
                 <w:szCs w:val="20"/>
               </w:rPr>
             </w:pPr>
+            <w:r>
+              <w:rPr>
+                <w:sz w:val="20"/>
+                <w:szCs w:val="20"/>
+              </w:rPr>
+              <w:t>0000+0010=0010</w:t>
+            </w:r>
           </w:p>
         </w:tc>
         <w:tc>
@@ -3094,6 +1953,13 @@
                 <w:szCs w:val="20"/>
               </w:rPr>
             </w:pPr>
+            <w:r>
+              <w:rPr>
+                <w:sz w:val="20"/>
+                <w:szCs w:val="20"/>
+              </w:rPr>
+              <w:t>0110xor1011=1101</w:t>
+            </w:r>
           </w:p>
         </w:tc>
         <w:tc>
@@ -3240,6 +2106,13 @@
                 <w:szCs w:val="20"/>
               </w:rPr>
             </w:pPr>
+            <w:r>
+              <w:rPr>
+                <w:sz w:val="20"/>
+                <w:szCs w:val="20"/>
+              </w:rPr>
+              <w:t>~0000=1111</w:t>
+            </w:r>
           </w:p>
         </w:tc>
         <w:tc>
@@ -3456,6 +2329,13 @@
                 <w:szCs w:val="20"/>
               </w:rPr>
             </w:pPr>
+            <w:r>
+              <w:rPr>
+                <w:sz w:val="20"/>
+                <w:szCs w:val="20"/>
+              </w:rPr>
+              <w:t>0010| 0110</w:t>
+            </w:r>
           </w:p>
         </w:tc>
         <w:tc>
@@ -3630,6 +2510,13 @@
                 <w:szCs w:val="20"/>
               </w:rPr>
             </w:pPr>
+            <w:r>
+              <w:rPr>
+                <w:sz w:val="20"/>
+                <w:szCs w:val="20"/>
+              </w:rPr>
+              <w:t>1011 &amp; 0000=0000</w:t>
+            </w:r>
           </w:p>
         </w:tc>
         <w:tc>
@@ -3658,6 +2545,7 @@
           <w:iCs/>
           <w:sz w:val="20"/>
           <w:szCs w:val="20"/>
+          <w:lang w:val="en-US"/>
         </w:rPr>
       </w:pPr>
       <w:r>
@@ -3667,11 +2555,13 @@
           <w:iCs/>
           <w:sz w:val="20"/>
           <w:szCs w:val="20"/>
-        </w:rPr>
-        <w:t xml:space="preserve">Table 1. Test </w:t>
-      </w:r>
-      <w:proofErr w:type="spellStart"/>
-      <w:r>
+          <w:lang w:val="en-US"/>
+        </w:rPr>
+        <w:t>Table 1. Test to be executed</w:t>
+      </w:r>
+    </w:p>
+    <w:p>
+      <w:pPr>
         <w:rPr>
           <w:rFonts w:ascii="Arial" w:hAnsi="Arial" w:cs="Arial"/>
           <w:i/>
@@ -3679,9 +2569,7 @@
           <w:sz w:val="20"/>
           <w:szCs w:val="20"/>
         </w:rPr>
-        <w:t>to</w:t>
-      </w:r>
-      <w:proofErr w:type="spellEnd"/>
+      </w:pPr>
       <w:r>
         <w:rPr>
           <w:rFonts w:ascii="Arial" w:hAnsi="Arial" w:cs="Arial"/>
@@ -3690,7 +2578,7 @@
           <w:sz w:val="20"/>
           <w:szCs w:val="20"/>
         </w:rPr>
-        <w:t xml:space="preserve"> be </w:t>
+        <w:t xml:space="preserve">Leds que </w:t>
       </w:r>
       <w:proofErr w:type="spellStart"/>
       <w:r>
@@ -3701,13 +2589,32 @@
           <w:sz w:val="20"/>
           <w:szCs w:val="20"/>
         </w:rPr>
-        <w:t>executed</w:t>
+        <w:t>utlic</w:t>
+      </w:r>
+      <w:r>
+        <w:rPr>
+          <w:rFonts w:ascii="Arial" w:hAnsi="Arial" w:cs="Arial"/>
+          <w:i/>
+          <w:iCs/>
+          <w:sz w:val="20"/>
+          <w:szCs w:val="20"/>
+        </w:rPr>
+        <w:t>é</w:t>
       </w:r>
       <w:proofErr w:type="spellEnd"/>
+      <w:r>
+        <w:rPr>
+          <w:rFonts w:ascii="Arial" w:hAnsi="Arial" w:cs="Arial"/>
+          <w:i/>
+          <w:iCs/>
+          <w:sz w:val="20"/>
+          <w:szCs w:val="20"/>
+        </w:rPr>
+        <w:t xml:space="preserve"> para representar el resultado</w:t>
+      </w:r>
     </w:p>
     <w:p>
       <w:pPr>
-        <w:jc w:val="center"/>
         <w:rPr>
           <w:rFonts w:ascii="Arial" w:hAnsi="Arial" w:cs="Arial"/>
           <w:i/>
@@ -3719,293 +2626,25 @@
     </w:p>
     <w:p>
       <w:pPr>
-        <w:jc w:val="both"/>
-        <w:rPr>
-          <w:rFonts w:ascii="Arial" w:hAnsi="Arial" w:cs="Arial"/>
-          <w:sz w:val="20"/>
-          <w:szCs w:val="20"/>
-        </w:rPr>
-      </w:pPr>
-      <w:proofErr w:type="spellStart"/>
-      <w:r>
-        <w:rPr>
-          <w:rFonts w:ascii="Arial" w:hAnsi="Arial" w:cs="Arial"/>
-          <w:sz w:val="20"/>
-          <w:szCs w:val="20"/>
-        </w:rPr>
-        <w:t>Deliverables</w:t>
-      </w:r>
-      <w:proofErr w:type="spellEnd"/>
-      <w:r>
-        <w:rPr>
-          <w:rFonts w:ascii="Arial" w:hAnsi="Arial" w:cs="Arial"/>
-          <w:sz w:val="20"/>
-          <w:szCs w:val="20"/>
-        </w:rPr>
-        <w:t>:</w:t>
-      </w:r>
+        <w:rPr>
+          <w:rFonts w:ascii="Arial" w:hAnsi="Arial" w:cs="Arial"/>
+          <w:i/>
+          <w:iCs/>
+          <w:sz w:val="20"/>
+          <w:szCs w:val="20"/>
+        </w:rPr>
+      </w:pPr>
     </w:p>
     <w:p>
       <w:pPr>
-        <w:jc w:val="both"/>
-        <w:rPr>
-          <w:rFonts w:ascii="Arial" w:hAnsi="Arial" w:cs="Arial"/>
-          <w:sz w:val="20"/>
-          <w:szCs w:val="20"/>
-        </w:rPr>
-      </w:pPr>
-      <w:proofErr w:type="spellStart"/>
-      <w:r>
-        <w:rPr>
-          <w:rFonts w:ascii="Arial" w:hAnsi="Arial" w:cs="Arial"/>
-          <w:sz w:val="20"/>
-          <w:szCs w:val="20"/>
-        </w:rPr>
-        <w:t>Upload</w:t>
-      </w:r>
-      <w:proofErr w:type="spellEnd"/>
-      <w:r>
-        <w:rPr>
-          <w:rFonts w:ascii="Arial" w:hAnsi="Arial" w:cs="Arial"/>
-          <w:sz w:val="20"/>
-          <w:szCs w:val="20"/>
-        </w:rPr>
-        <w:t xml:space="preserve"> a </w:t>
-      </w:r>
-      <w:proofErr w:type="spellStart"/>
-      <w:r>
-        <w:rPr>
-          <w:rFonts w:ascii="Arial" w:hAnsi="Arial" w:cs="Arial"/>
-          <w:sz w:val="20"/>
-          <w:szCs w:val="20"/>
-        </w:rPr>
-        <w:t>picture</w:t>
-      </w:r>
-      <w:proofErr w:type="spellEnd"/>
-      <w:r>
-        <w:rPr>
-          <w:rFonts w:ascii="Arial" w:hAnsi="Arial" w:cs="Arial"/>
-          <w:sz w:val="20"/>
-          <w:szCs w:val="20"/>
-        </w:rPr>
-        <w:t xml:space="preserve"> </w:t>
-      </w:r>
-      <w:proofErr w:type="spellStart"/>
-      <w:r>
-        <w:rPr>
-          <w:rFonts w:ascii="Arial" w:hAnsi="Arial" w:cs="Arial"/>
-          <w:sz w:val="20"/>
-          <w:szCs w:val="20"/>
-        </w:rPr>
-        <w:t>for</w:t>
-      </w:r>
-      <w:proofErr w:type="spellEnd"/>
-      <w:r>
-        <w:rPr>
-          <w:rFonts w:ascii="Arial" w:hAnsi="Arial" w:cs="Arial"/>
-          <w:sz w:val="20"/>
-          <w:szCs w:val="20"/>
-        </w:rPr>
-        <w:t xml:space="preserve"> </w:t>
-      </w:r>
-      <w:proofErr w:type="spellStart"/>
-      <w:r>
-        <w:rPr>
-          <w:rFonts w:ascii="Arial" w:hAnsi="Arial" w:cs="Arial"/>
-          <w:sz w:val="20"/>
-          <w:szCs w:val="20"/>
-        </w:rPr>
-        <w:t>each</w:t>
-      </w:r>
-      <w:proofErr w:type="spellEnd"/>
-      <w:r>
-        <w:rPr>
-          <w:rFonts w:ascii="Arial" w:hAnsi="Arial" w:cs="Arial"/>
-          <w:sz w:val="20"/>
-          <w:szCs w:val="20"/>
-        </w:rPr>
-        <w:t xml:space="preserve"> test </w:t>
-      </w:r>
-      <w:proofErr w:type="spellStart"/>
-      <w:r>
-        <w:rPr>
-          <w:rFonts w:ascii="Arial" w:hAnsi="Arial" w:cs="Arial"/>
-          <w:sz w:val="20"/>
-          <w:szCs w:val="20"/>
-        </w:rPr>
-        <w:t>showing</w:t>
-      </w:r>
-      <w:proofErr w:type="spellEnd"/>
-      <w:r>
-        <w:rPr>
-          <w:rFonts w:ascii="Arial" w:hAnsi="Arial" w:cs="Arial"/>
-          <w:sz w:val="20"/>
-          <w:szCs w:val="20"/>
-        </w:rPr>
-        <w:t xml:space="preserve"> actual </w:t>
-      </w:r>
-      <w:proofErr w:type="spellStart"/>
-      <w:r>
-        <w:rPr>
-          <w:rFonts w:ascii="Arial" w:hAnsi="Arial" w:cs="Arial"/>
-          <w:sz w:val="20"/>
-          <w:szCs w:val="20"/>
-        </w:rPr>
-        <w:t>result</w:t>
-      </w:r>
-      <w:proofErr w:type="spellEnd"/>
-      <w:r>
-        <w:rPr>
-          <w:rFonts w:ascii="Arial" w:hAnsi="Arial" w:cs="Arial"/>
-          <w:sz w:val="20"/>
-          <w:szCs w:val="20"/>
-        </w:rPr>
-        <w:t xml:space="preserve">. </w:t>
-      </w:r>
-      <w:proofErr w:type="spellStart"/>
-      <w:r>
-        <w:rPr>
-          <w:rFonts w:ascii="Arial" w:hAnsi="Arial" w:cs="Arial"/>
-          <w:sz w:val="20"/>
-          <w:szCs w:val="20"/>
-        </w:rPr>
-        <w:t>Everything</w:t>
-      </w:r>
-      <w:proofErr w:type="spellEnd"/>
-      <w:r>
-        <w:rPr>
-          <w:rFonts w:ascii="Arial" w:hAnsi="Arial" w:cs="Arial"/>
-          <w:sz w:val="20"/>
-          <w:szCs w:val="20"/>
-        </w:rPr>
-        <w:t xml:space="preserve"> </w:t>
-      </w:r>
-      <w:proofErr w:type="spellStart"/>
-      <w:r>
-        <w:rPr>
-          <w:rFonts w:ascii="Arial" w:hAnsi="Arial" w:cs="Arial"/>
-          <w:sz w:val="20"/>
-          <w:szCs w:val="20"/>
-        </w:rPr>
-        <w:t>must</w:t>
-      </w:r>
-      <w:proofErr w:type="spellEnd"/>
-      <w:r>
-        <w:rPr>
-          <w:rFonts w:ascii="Arial" w:hAnsi="Arial" w:cs="Arial"/>
-          <w:sz w:val="20"/>
-          <w:szCs w:val="20"/>
-        </w:rPr>
-        <w:t xml:space="preserve"> be </w:t>
-      </w:r>
-      <w:proofErr w:type="spellStart"/>
-      <w:r>
-        <w:rPr>
-          <w:rFonts w:ascii="Arial" w:hAnsi="Arial" w:cs="Arial"/>
-          <w:sz w:val="20"/>
-          <w:szCs w:val="20"/>
-        </w:rPr>
-        <w:t>updated</w:t>
-      </w:r>
-      <w:proofErr w:type="spellEnd"/>
-      <w:r>
-        <w:rPr>
-          <w:rFonts w:ascii="Arial" w:hAnsi="Arial" w:cs="Arial"/>
-          <w:sz w:val="20"/>
-          <w:szCs w:val="20"/>
-        </w:rPr>
-        <w:t xml:space="preserve"> in individual </w:t>
-      </w:r>
-      <w:proofErr w:type="spellStart"/>
-      <w:r>
-        <w:rPr>
-          <w:rFonts w:ascii="Arial" w:hAnsi="Arial" w:cs="Arial"/>
-          <w:sz w:val="20"/>
-          <w:szCs w:val="20"/>
-        </w:rPr>
-        <w:t>repository</w:t>
-      </w:r>
-      <w:proofErr w:type="spellEnd"/>
-      <w:r>
-        <w:rPr>
-          <w:rFonts w:ascii="Arial" w:hAnsi="Arial" w:cs="Arial"/>
-          <w:sz w:val="20"/>
-          <w:szCs w:val="20"/>
-        </w:rPr>
-        <w:t xml:space="preserve"> </w:t>
-      </w:r>
-      <w:r>
-        <w:rPr>
-          <w:rFonts w:ascii="Arial" w:hAnsi="Arial" w:cs="Arial"/>
-          <w:sz w:val="20"/>
-          <w:szCs w:val="20"/>
-        </w:rPr>
-        <w:t xml:space="preserve">and </w:t>
-      </w:r>
-      <w:proofErr w:type="spellStart"/>
-      <w:r>
-        <w:rPr>
-          <w:rFonts w:ascii="Arial" w:hAnsi="Arial" w:cs="Arial"/>
-          <w:sz w:val="20"/>
-          <w:szCs w:val="20"/>
-        </w:rPr>
-        <w:t>tagged</w:t>
-      </w:r>
-      <w:proofErr w:type="spellEnd"/>
-      <w:r>
-        <w:rPr>
-          <w:rFonts w:ascii="Arial" w:hAnsi="Arial" w:cs="Arial"/>
-          <w:sz w:val="20"/>
-          <w:szCs w:val="20"/>
-        </w:rPr>
-        <w:t xml:space="preserve"> </w:t>
-      </w:r>
-      <w:proofErr w:type="spellStart"/>
-      <w:r>
-        <w:rPr>
-          <w:rFonts w:ascii="Arial" w:hAnsi="Arial" w:cs="Arial"/>
-          <w:sz w:val="20"/>
-          <w:szCs w:val="20"/>
-        </w:rPr>
-        <w:t>with</w:t>
-      </w:r>
-      <w:proofErr w:type="spellEnd"/>
-      <w:r>
-        <w:rPr>
-          <w:rFonts w:ascii="Arial" w:hAnsi="Arial" w:cs="Arial"/>
-          <w:sz w:val="20"/>
-          <w:szCs w:val="20"/>
-        </w:rPr>
-        <w:t xml:space="preserve"> </w:t>
-      </w:r>
-      <w:proofErr w:type="spellStart"/>
-      <w:r>
-        <w:rPr>
-          <w:rFonts w:ascii="Arial" w:hAnsi="Arial" w:cs="Arial"/>
-          <w:sz w:val="20"/>
-          <w:szCs w:val="20"/>
-        </w:rPr>
-        <w:t>proper</w:t>
-      </w:r>
-      <w:proofErr w:type="spellEnd"/>
-      <w:r>
-        <w:rPr>
-          <w:rFonts w:ascii="Arial" w:hAnsi="Arial" w:cs="Arial"/>
-          <w:sz w:val="20"/>
-          <w:szCs w:val="20"/>
-        </w:rPr>
-        <w:t xml:space="preserve"> </w:t>
-      </w:r>
-      <w:proofErr w:type="spellStart"/>
-      <w:r>
-        <w:rPr>
-          <w:rFonts w:ascii="Arial" w:hAnsi="Arial" w:cs="Arial"/>
-          <w:sz w:val="20"/>
-          <w:szCs w:val="20"/>
-        </w:rPr>
-        <w:t>format</w:t>
-      </w:r>
-      <w:proofErr w:type="spellEnd"/>
+        <w:rPr>
+          <w:rFonts w:ascii="Arial" w:hAnsi="Arial" w:cs="Arial"/>
+          <w:i/>
+          <w:iCs/>
+          <w:sz w:val="20"/>
+          <w:szCs w:val="20"/>
+        </w:rPr>
+      </w:pPr>
     </w:p>
     <w:p>
       <w:pPr>
@@ -4016,6 +2655,24 @@
           <w:szCs w:val="20"/>
         </w:rPr>
       </w:pPr>
+      <w:proofErr w:type="spellStart"/>
+      <w:r>
+        <w:rPr>
+          <w:rFonts w:ascii="Arial" w:hAnsi="Arial" w:cs="Arial"/>
+          <w:sz w:val="20"/>
+          <w:szCs w:val="20"/>
+        </w:rPr>
+        <w:t>Deliverables</w:t>
+      </w:r>
+      <w:proofErr w:type="spellEnd"/>
+      <w:r>
+        <w:rPr>
+          <w:rFonts w:ascii="Arial" w:hAnsi="Arial" w:cs="Arial"/>
+          <w:sz w:val="20"/>
+          <w:szCs w:val="20"/>
+        </w:rPr>
+        <w:t>:</w:t>
+      </w:r>
     </w:p>
     <w:p>
       <w:pPr>
@@ -4024,185 +2681,95 @@
           <w:rFonts w:ascii="Arial" w:hAnsi="Arial" w:cs="Arial"/>
           <w:sz w:val="20"/>
           <w:szCs w:val="20"/>
-        </w:rPr>
-      </w:pPr>
-      <w:r>
-        <w:rPr>
-          <w:rFonts w:ascii="Arial" w:hAnsi="Arial" w:cs="Arial"/>
-          <w:sz w:val="20"/>
-          <w:szCs w:val="20"/>
-        </w:rPr>
-        <w:t xml:space="preserve">Extra </w:t>
-      </w:r>
-      <w:proofErr w:type="spellStart"/>
-      <w:r>
-        <w:rPr>
-          <w:rFonts w:ascii="Arial" w:hAnsi="Arial" w:cs="Arial"/>
-          <w:sz w:val="20"/>
-          <w:szCs w:val="20"/>
-        </w:rPr>
-        <w:t>points</w:t>
-      </w:r>
-      <w:proofErr w:type="spellEnd"/>
-      <w:r>
-        <w:rPr>
-          <w:rFonts w:ascii="Arial" w:hAnsi="Arial" w:cs="Arial"/>
-          <w:sz w:val="20"/>
-          <w:szCs w:val="20"/>
-        </w:rPr>
-        <w:t xml:space="preserve">: 30% </w:t>
-      </w:r>
-      <w:proofErr w:type="spellStart"/>
-      <w:r>
-        <w:rPr>
-          <w:rFonts w:ascii="Arial" w:hAnsi="Arial" w:cs="Arial"/>
-          <w:sz w:val="20"/>
-          <w:szCs w:val="20"/>
-        </w:rPr>
-        <w:t>if</w:t>
-      </w:r>
-      <w:proofErr w:type="spellEnd"/>
-      <w:r>
-        <w:rPr>
-          <w:rFonts w:ascii="Arial" w:hAnsi="Arial" w:cs="Arial"/>
-          <w:sz w:val="20"/>
-          <w:szCs w:val="20"/>
-        </w:rPr>
-        <w:t xml:space="preserve"> </w:t>
-      </w:r>
-      <w:proofErr w:type="spellStart"/>
-      <w:r>
-        <w:rPr>
-          <w:rFonts w:ascii="Arial" w:hAnsi="Arial" w:cs="Arial"/>
-          <w:sz w:val="20"/>
-          <w:szCs w:val="20"/>
-        </w:rPr>
-        <w:t>any</w:t>
-      </w:r>
-      <w:proofErr w:type="spellEnd"/>
-      <w:r>
-        <w:rPr>
-          <w:rFonts w:ascii="Arial" w:hAnsi="Arial" w:cs="Arial"/>
-          <w:sz w:val="20"/>
-          <w:szCs w:val="20"/>
-        </w:rPr>
-        <w:t xml:space="preserve"> </w:t>
-      </w:r>
-      <w:proofErr w:type="spellStart"/>
-      <w:r>
-        <w:rPr>
-          <w:rFonts w:ascii="Arial" w:hAnsi="Arial" w:cs="Arial"/>
-          <w:sz w:val="20"/>
-          <w:szCs w:val="20"/>
-        </w:rPr>
-        <w:t>testbench</w:t>
-      </w:r>
-      <w:proofErr w:type="spellEnd"/>
-      <w:r>
-        <w:rPr>
-          <w:rFonts w:ascii="Arial" w:hAnsi="Arial" w:cs="Arial"/>
-          <w:sz w:val="20"/>
-          <w:szCs w:val="20"/>
-        </w:rPr>
-        <w:t xml:space="preserve"> </w:t>
-      </w:r>
-      <w:proofErr w:type="spellStart"/>
-      <w:r>
-        <w:rPr>
-          <w:rFonts w:ascii="Arial" w:hAnsi="Arial" w:cs="Arial"/>
-          <w:sz w:val="20"/>
-          <w:szCs w:val="20"/>
-        </w:rPr>
-        <w:t>is</w:t>
-      </w:r>
-      <w:proofErr w:type="spellEnd"/>
-      <w:r>
-        <w:rPr>
-          <w:rFonts w:ascii="Arial" w:hAnsi="Arial" w:cs="Arial"/>
-          <w:sz w:val="20"/>
-          <w:szCs w:val="20"/>
-        </w:rPr>
-        <w:t xml:space="preserve"> </w:t>
-      </w:r>
-      <w:proofErr w:type="spellStart"/>
-      <w:r>
-        <w:rPr>
-          <w:rFonts w:ascii="Arial" w:hAnsi="Arial" w:cs="Arial"/>
-          <w:sz w:val="20"/>
-          <w:szCs w:val="20"/>
-        </w:rPr>
-        <w:t>executed</w:t>
-      </w:r>
-      <w:proofErr w:type="spellEnd"/>
-      <w:r>
-        <w:rPr>
-          <w:rFonts w:ascii="Arial" w:hAnsi="Arial" w:cs="Arial"/>
-          <w:sz w:val="20"/>
-          <w:szCs w:val="20"/>
-        </w:rPr>
-        <w:t xml:space="preserve"> in </w:t>
-      </w:r>
-      <w:proofErr w:type="spellStart"/>
-      <w:r>
-        <w:rPr>
-          <w:rFonts w:ascii="Arial" w:hAnsi="Arial" w:cs="Arial"/>
-          <w:sz w:val="20"/>
-          <w:szCs w:val="20"/>
-        </w:rPr>
-        <w:t>Questa</w:t>
-      </w:r>
-      <w:proofErr w:type="spellEnd"/>
-      <w:r>
-        <w:rPr>
-          <w:rFonts w:ascii="Arial" w:hAnsi="Arial" w:cs="Arial"/>
-          <w:sz w:val="20"/>
-          <w:szCs w:val="20"/>
-        </w:rPr>
-        <w:t xml:space="preserve"> Sim</w:t>
-      </w:r>
-      <w:r>
-        <w:rPr>
-          <w:rFonts w:ascii="Arial" w:hAnsi="Arial" w:cs="Arial"/>
-          <w:sz w:val="20"/>
-          <w:szCs w:val="20"/>
-        </w:rPr>
-        <w:t xml:space="preserve"> and </w:t>
-      </w:r>
-      <w:proofErr w:type="spellStart"/>
-      <w:r>
-        <w:rPr>
-          <w:rFonts w:ascii="Arial" w:hAnsi="Arial" w:cs="Arial"/>
-          <w:sz w:val="20"/>
-          <w:szCs w:val="20"/>
-        </w:rPr>
-        <w:t>screenshots</w:t>
-      </w:r>
-      <w:proofErr w:type="spellEnd"/>
-      <w:r>
-        <w:rPr>
-          <w:rFonts w:ascii="Arial" w:hAnsi="Arial" w:cs="Arial"/>
-          <w:sz w:val="20"/>
-          <w:szCs w:val="20"/>
-        </w:rPr>
-        <w:t xml:space="preserve"> are </w:t>
-      </w:r>
-      <w:proofErr w:type="spellStart"/>
-      <w:r>
-        <w:rPr>
-          <w:rFonts w:ascii="Arial" w:hAnsi="Arial" w:cs="Arial"/>
-          <w:sz w:val="20"/>
-          <w:szCs w:val="20"/>
-        </w:rPr>
-        <w:t>attached</w:t>
-      </w:r>
-      <w:proofErr w:type="spellEnd"/>
-      <w:r>
-        <w:rPr>
-          <w:rFonts w:ascii="Arial" w:hAnsi="Arial" w:cs="Arial"/>
-          <w:sz w:val="20"/>
-          <w:szCs w:val="20"/>
-        </w:rPr>
-        <w:t>.</w:t>
+          <w:lang w:val="en-US"/>
+        </w:rPr>
+      </w:pPr>
+      <w:r>
+        <w:rPr>
+          <w:rFonts w:ascii="Arial" w:hAnsi="Arial" w:cs="Arial"/>
+          <w:sz w:val="20"/>
+          <w:szCs w:val="20"/>
+          <w:lang w:val="en-US"/>
+        </w:rPr>
+        <w:t xml:space="preserve">Upload a picture for each test showing actual </w:t>
+      </w:r>
+      <w:proofErr w:type="gramStart"/>
+      <w:r>
+        <w:rPr>
+          <w:rFonts w:ascii="Arial" w:hAnsi="Arial" w:cs="Arial"/>
+          <w:sz w:val="20"/>
+          <w:szCs w:val="20"/>
+          <w:lang w:val="en-US"/>
+        </w:rPr>
+        <w:t>result</w:t>
+      </w:r>
+      <w:proofErr w:type="gramEnd"/>
+      <w:r>
+        <w:rPr>
+          <w:rFonts w:ascii="Arial" w:hAnsi="Arial" w:cs="Arial"/>
+          <w:sz w:val="20"/>
+          <w:szCs w:val="20"/>
+          <w:lang w:val="en-US"/>
+        </w:rPr>
+        <w:t xml:space="preserve">. Everything must be updated in individual repository </w:t>
+      </w:r>
+      <w:r>
+        <w:rPr>
+          <w:rFonts w:ascii="Arial" w:hAnsi="Arial" w:cs="Arial"/>
+          <w:sz w:val="20"/>
+          <w:szCs w:val="20"/>
+          <w:lang w:val="en-US"/>
+        </w:rPr>
+        <w:t>and tagged with proper format</w:t>
+      </w:r>
+    </w:p>
+    <w:p>
+      <w:pPr>
+        <w:jc w:val="both"/>
+        <w:rPr>
+          <w:rFonts w:ascii="Arial" w:hAnsi="Arial" w:cs="Arial"/>
+          <w:sz w:val="20"/>
+          <w:szCs w:val="20"/>
+          <w:lang w:val="en-US"/>
+        </w:rPr>
+      </w:pPr>
+    </w:p>
+    <w:p>
+      <w:pPr>
+        <w:jc w:val="both"/>
+        <w:rPr>
+          <w:rFonts w:ascii="Arial" w:hAnsi="Arial" w:cs="Arial"/>
+          <w:sz w:val="20"/>
+          <w:szCs w:val="20"/>
+          <w:lang w:val="en-US"/>
+        </w:rPr>
+      </w:pPr>
+      <w:r>
+        <w:rPr>
+          <w:rFonts w:ascii="Arial" w:hAnsi="Arial" w:cs="Arial"/>
+          <w:sz w:val="20"/>
+          <w:szCs w:val="20"/>
+          <w:lang w:val="en-US"/>
+        </w:rPr>
+        <w:t xml:space="preserve">Extra points: 30% if any testbench is executed in </w:t>
+      </w:r>
+      <w:r>
+        <w:rPr>
+          <w:rFonts w:ascii="Arial" w:hAnsi="Arial" w:cs="Arial"/>
+          <w:sz w:val="20"/>
+          <w:szCs w:val="20"/>
+          <w:lang w:val="en-US"/>
+        </w:rPr>
+        <w:t>Questa Sim</w:t>
+      </w:r>
+      <w:r>
+        <w:rPr>
+          <w:rFonts w:ascii="Arial" w:hAnsi="Arial" w:cs="Arial"/>
+          <w:sz w:val="20"/>
+          <w:szCs w:val="20"/>
+          <w:lang w:val="en-US"/>
+        </w:rPr>
+        <w:t xml:space="preserve"> and screenshots are attached.</w:t>
       </w:r>
     </w:p>
     <w:sectPr>
@@ -4219,7 +2786,7 @@
 </file>
 
 <file path=word/endnotes.xml><?xml version="1.0" encoding="utf-8"?>
-<w:endnotes xmlns:wpc="http://schemas.microsoft.com/office/word/2010/wordprocessingCanvas" xmlns:cx="http://schemas.microsoft.com/office/drawing/2014/chartex" xmlns:cx1="http://schemas.microsoft.com/office/drawing/2015/9/8/chartex" xmlns:cx2="http://schemas.microsoft.com/office/drawing/2015/10/21/chartex" xmlns:cx3="http://schemas.microsoft.com/office/drawing/2016/5/9/chartex" xmlns:cx4="http://schemas.microsoft.com/office/drawing/2016/5/10/chartex" xmlns:cx5="http://schemas.microsoft.com/office/drawing/2016/5/11/chartex" xmlns:cx6="http://schemas.microsoft.com/office/drawing/2016/5/12/chartex" xmlns:cx7="http://schemas.microsoft.com/office/drawing/2016/5/13/chartex" xmlns:cx8="http://schemas.microsoft.com/office/drawing/2016/5/14/chartex" xmlns:mc="http://schemas.openxmlformats.org/markup-compatibility/2006" xmlns:aink="http://schemas.microsoft.com/office/drawing/2016/ink" xmlns:am3d="http://schemas.microsoft.com/office/drawing/2017/model3d" xmlns:o="urn:schemas-microsoft-com:office:office" xmlns:oel="http://schemas.microsoft.com/office/2019/extlst" xmlns:r="http://schemas.openxmlformats.org/officeDocument/2006/relationships" xmlns:m="http://schemas.openxmlformats.org/officeDocument/2006/math" xmlns:v="urn:schemas-microsoft-com:vml" xmlns:wp14="http://schemas.microsoft.com/office/word/2010/wordprocessingDrawing" xmlns:wp="http://schemas.openxmlformats.org/drawingml/2006/wordprocessingDrawing" xmlns:w10="urn:schemas-microsoft-com:office:word" xmlns:w="http://schemas.openxmlformats.org/wordprocessingml/2006/main" xmlns:w14="http://schemas.microsoft.com/office/word/2010/wordml" xmlns:w15="http://schemas.microsoft.com/office/word/2012/wordml" xmlns:w16cei="http://schemas.microsoft.com/office/word/2026/wordml/cei" xmlns:w16cex="http://schemas.microsoft.com/office/word/2018/wordml/cex" xmlns:w16cid="http://schemas.microsoft.com/office/word/2016/wordml/cid" xmlns:w16="http://schemas.microsoft.com/office/word/2018/wordml" xmlns:w16du="http://schemas.microsoft.com/office/word/2023/wordml/word16du" xmlns:w16sdtdh="http://schemas.microsoft.com/office/word/2020/wordml/sdtdatahash" xmlns:w16sdtfl="http://schemas.microsoft.com/office/word/2024/wordml/sdtformatlock" xmlns:w16se="http://schemas.microsoft.com/office/word/2015/wordml/symex" xmlns:wpg="http://schemas.microsoft.com/office/word/2010/wordprocessingGroup" xmlns:wpi="http://schemas.microsoft.com/office/word/2010/wordprocessingInk" xmlns:wne="http://schemas.microsoft.com/office/word/2006/wordml" xmlns:wps="http://schemas.microsoft.com/office/word/2010/wordprocessingShape" mc:Ignorable="w14 w15 w16se w16cid w16 w16cex w16sdtdh w16sdtfl w16du wp14">
+<w:endnotes xmlns:wpc="http://schemas.microsoft.com/office/word/2010/wordprocessingCanvas" xmlns:cx="http://schemas.microsoft.com/office/drawing/2014/chartex" xmlns:cx1="http://schemas.microsoft.com/office/drawing/2015/9/8/chartex" xmlns:cx2="http://schemas.microsoft.com/office/drawing/2015/10/21/chartex" xmlns:cx3="http://schemas.microsoft.com/office/drawing/2016/5/9/chartex" xmlns:cx4="http://schemas.microsoft.com/office/drawing/2016/5/10/chartex" xmlns:cx5="http://schemas.microsoft.com/office/drawing/2016/5/11/chartex" xmlns:cx6="http://schemas.microsoft.com/office/drawing/2016/5/12/chartex" xmlns:cx7="http://schemas.microsoft.com/office/drawing/2016/5/13/chartex" xmlns:cx8="http://schemas.microsoft.com/office/drawing/2016/5/14/chartex" xmlns:mc="http://schemas.openxmlformats.org/markup-compatibility/2006" xmlns:aink="http://schemas.microsoft.com/office/drawing/2016/ink" xmlns:am3d="http://schemas.microsoft.com/office/drawing/2017/model3d" xmlns:o="urn:schemas-microsoft-com:office:office" xmlns:oel="http://schemas.microsoft.com/office/2019/extlst" xmlns:r="http://schemas.openxmlformats.org/officeDocument/2006/relationships" xmlns:m="http://schemas.openxmlformats.org/officeDocument/2006/math" xmlns:v="urn:schemas-microsoft-com:vml" xmlns:wp14="http://schemas.microsoft.com/office/word/2010/wordprocessingDrawing" xmlns:wp="http://schemas.openxmlformats.org/drawingml/2006/wordprocessingDrawing" xmlns:w10="urn:schemas-microsoft-com:office:word" xmlns:w="http://schemas.openxmlformats.org/wordprocessingml/2006/main" xmlns:w14="http://schemas.microsoft.com/office/word/2010/wordml" xmlns:w15="http://schemas.microsoft.com/office/word/2012/wordml" xmlns:w16cex="http://schemas.microsoft.com/office/word/2018/wordml/cex" xmlns:w16cid="http://schemas.microsoft.com/office/word/2016/wordml/cid" xmlns:w16="http://schemas.microsoft.com/office/word/2018/wordml" xmlns:w16du="http://schemas.microsoft.com/office/word/2023/wordml/word16du" xmlns:w16sdtdh="http://schemas.microsoft.com/office/word/2020/wordml/sdtdatahash" xmlns:w16sdtfl="http://schemas.microsoft.com/office/word/2024/wordml/sdtformatlock" xmlns:w16se="http://schemas.microsoft.com/office/word/2015/wordml/symex" xmlns:wpg="http://schemas.microsoft.com/office/word/2010/wordprocessingGroup" xmlns:wpi="http://schemas.microsoft.com/office/word/2010/wordprocessingInk" xmlns:wne="http://schemas.microsoft.com/office/word/2006/wordml" xmlns:wps="http://schemas.microsoft.com/office/word/2010/wordprocessingShape" mc:Ignorable="w14 w15 w16se w16cid w16 w16cex w16sdtdh w16sdtfl w16du wp14">
   <w:endnote w:type="separator" w:id="-1">
     <w:p>
       <w:r>
@@ -4238,7 +2805,7 @@
 </file>
 
 <file path=word/footer1.xml><?xml version="1.0" encoding="utf-8"?>
-<w:ftr xmlns:wpc="http://schemas.microsoft.com/office/word/2010/wordprocessingCanvas" xmlns:cx="http://schemas.microsoft.com/office/drawing/2014/chartex" xmlns:cx1="http://schemas.microsoft.com/office/drawing/2015/9/8/chartex" xmlns:cx2="http://schemas.microsoft.com/office/drawing/2015/10/21/chartex" xmlns:cx3="http://schemas.microsoft.com/office/drawing/2016/5/9/chartex" xmlns:cx4="http://schemas.microsoft.com/office/drawing/2016/5/10/chartex" xmlns:cx5="http://schemas.microsoft.com/office/drawing/2016/5/11/chartex" xmlns:cx6="http://schemas.microsoft.com/office/drawing/2016/5/12/chartex" xmlns:cx7="http://schemas.microsoft.com/office/drawing/2016/5/13/chartex" xmlns:cx8="http://schemas.microsoft.com/office/drawing/2016/5/14/chartex" xmlns:mc="http://schemas.openxmlformats.org/markup-compatibility/2006" xmlns:aink="http://schemas.microsoft.com/office/drawing/2016/ink" xmlns:am3d="http://schemas.microsoft.com/office/drawing/2017/model3d" xmlns:o="urn:schemas-microsoft-com:office:office" xmlns:oel="http://schemas.microsoft.com/office/2019/extlst" xmlns:r="http://schemas.openxmlformats.org/officeDocument/2006/relationships" xmlns:m="http://schemas.openxmlformats.org/officeDocument/2006/math" xmlns:v="urn:schemas-microsoft-com:vml" xmlns:wp14="http://schemas.microsoft.com/office/word/2010/wordprocessingDrawing" xmlns:wp="http://schemas.openxmlformats.org/drawingml/2006/wordprocessingDrawing" xmlns:w10="urn:schemas-microsoft-com:office:word" xmlns:w="http://schemas.openxmlformats.org/wordprocessingml/2006/main" xmlns:w14="http://schemas.microsoft.com/office/word/2010/wordml" xmlns:w15="http://schemas.microsoft.com/office/word/2012/wordml" xmlns:w16cei="http://schemas.microsoft.com/office/word/2026/wordml/cei" xmlns:w16cex="http://schemas.microsoft.com/office/word/2018/wordml/cex" xmlns:w16cid="http://schemas.microsoft.com/office/word/2016/wordml/cid" xmlns:w16="http://schemas.microsoft.com/office/word/2018/wordml" xmlns:w16du="http://schemas.microsoft.com/office/word/2023/wordml/word16du" xmlns:w16sdtdh="http://schemas.microsoft.com/office/word/2020/wordml/sdtdatahash" xmlns:w16sdtfl="http://schemas.microsoft.com/office/word/2024/wordml/sdtformatlock" xmlns:w16se="http://schemas.microsoft.com/office/word/2015/wordml/symex" xmlns:wpg="http://schemas.microsoft.com/office/word/2010/wordprocessingGroup" xmlns:wpi="http://schemas.microsoft.com/office/word/2010/wordprocessingInk" xmlns:wne="http://schemas.microsoft.com/office/word/2006/wordml" xmlns:wps="http://schemas.microsoft.com/office/word/2010/wordprocessingShape" mc:Ignorable="w14 w15 w16se w16cid w16 w16cex w16sdtdh w16sdtfl w16du wp14">
+<w:ftr xmlns:wpc="http://schemas.microsoft.com/office/word/2010/wordprocessingCanvas" xmlns:cx="http://schemas.microsoft.com/office/drawing/2014/chartex" xmlns:cx1="http://schemas.microsoft.com/office/drawing/2015/9/8/chartex" xmlns:cx2="http://schemas.microsoft.com/office/drawing/2015/10/21/chartex" xmlns:cx3="http://schemas.microsoft.com/office/drawing/2016/5/9/chartex" xmlns:cx4="http://schemas.microsoft.com/office/drawing/2016/5/10/chartex" xmlns:cx5="http://schemas.microsoft.com/office/drawing/2016/5/11/chartex" xmlns:cx6="http://schemas.microsoft.com/office/drawing/2016/5/12/chartex" xmlns:cx7="http://schemas.microsoft.com/office/drawing/2016/5/13/chartex" xmlns:cx8="http://schemas.microsoft.com/office/drawing/2016/5/14/chartex" xmlns:mc="http://schemas.openxmlformats.org/markup-compatibility/2006" xmlns:aink="http://schemas.microsoft.com/office/drawing/2016/ink" xmlns:am3d="http://schemas.microsoft.com/office/drawing/2017/model3d" xmlns:o="urn:schemas-microsoft-com:office:office" xmlns:oel="http://schemas.microsoft.com/office/2019/extlst" xmlns:r="http://schemas.openxmlformats.org/officeDocument/2006/relationships" xmlns:m="http://schemas.openxmlformats.org/officeDocument/2006/math" xmlns:v="urn:schemas-microsoft-com:vml" xmlns:wp14="http://schemas.microsoft.com/office/word/2010/wordprocessingDrawing" xmlns:wp="http://schemas.openxmlformats.org/drawingml/2006/wordprocessingDrawing" xmlns:w10="urn:schemas-microsoft-com:office:word" xmlns:w="http://schemas.openxmlformats.org/wordprocessingml/2006/main" xmlns:w14="http://schemas.microsoft.com/office/word/2010/wordml" xmlns:w15="http://schemas.microsoft.com/office/word/2012/wordml" xmlns:w16cex="http://schemas.microsoft.com/office/word/2018/wordml/cex" xmlns:w16cid="http://schemas.microsoft.com/office/word/2016/wordml/cid" xmlns:w16="http://schemas.microsoft.com/office/word/2018/wordml" xmlns:w16du="http://schemas.microsoft.com/office/word/2023/wordml/word16du" xmlns:w16sdtdh="http://schemas.microsoft.com/office/word/2020/wordml/sdtdatahash" xmlns:w16sdtfl="http://schemas.microsoft.com/office/word/2024/wordml/sdtformatlock" xmlns:w16se="http://schemas.microsoft.com/office/word/2015/wordml/symex" xmlns:wpg="http://schemas.microsoft.com/office/word/2010/wordprocessingGroup" xmlns:wpi="http://schemas.microsoft.com/office/word/2010/wordprocessingInk" xmlns:wne="http://schemas.microsoft.com/office/word/2006/wordml" xmlns:wps="http://schemas.microsoft.com/office/word/2010/wordprocessingShape" mc:Ignorable="w14 w15 w16se w16cid w16 w16cex w16sdtdh w16sdtfl w16du wp14">
   <w:p>
     <w:pPr>
       <w:pStyle w:val="Footer"/>
@@ -4330,7 +2897,7 @@
             </wp:anchor>
           </w:drawing>
         </mc:Choice>
-        <mc:Fallback>
+        <mc:Fallback xmlns:w16cei="http://schemas.microsoft.com/office/word/2026/wordml/cei">
           <w:pict>
             <v:shapetype w14:anchorId="057E3FE6" id="_x0000_t202" coordsize="21600,21600" o:spt="202" path="m,l,21600r21600,l21600,xe">
               <v:stroke joinstyle="miter"/>
@@ -4388,7 +2955,7 @@
 </file>
 
 <file path=word/footnotes.xml><?xml version="1.0" encoding="utf-8"?>
-<w:footnotes xmlns:wpc="http://schemas.microsoft.com/office/word/2010/wordprocessingCanvas" xmlns:cx="http://schemas.microsoft.com/office/drawing/2014/chartex" xmlns:cx1="http://schemas.microsoft.com/office/drawing/2015/9/8/chartex" xmlns:cx2="http://schemas.microsoft.com/office/drawing/2015/10/21/chartex" xmlns:cx3="http://schemas.microsoft.com/office/drawing/2016/5/9/chartex" xmlns:cx4="http://schemas.microsoft.com/office/drawing/2016/5/10/chartex" xmlns:cx5="http://schemas.microsoft.com/office/drawing/2016/5/11/chartex" xmlns:cx6="http://schemas.microsoft.com/office/drawing/2016/5/12/chartex" xmlns:cx7="http://schemas.microsoft.com/office/drawing/2016/5/13/chartex" xmlns:cx8="http://schemas.microsoft.com/office/drawing/2016/5/14/chartex" xmlns:mc="http://schemas.openxmlformats.org/markup-compatibility/2006" xmlns:aink="http://schemas.microsoft.com/office/drawing/2016/ink" xmlns:am3d="http://schemas.microsoft.com/office/drawing/2017/model3d" xmlns:o="urn:schemas-microsoft-com:office:office" xmlns:oel="http://schemas.microsoft.com/office/2019/extlst" xmlns:r="http://schemas.openxmlformats.org/officeDocument/2006/relationships" xmlns:m="http://schemas.openxmlformats.org/officeDocument/2006/math" xmlns:v="urn:schemas-microsoft-com:vml" xmlns:wp14="http://schemas.microsoft.com/office/word/2010/wordprocessingDrawing" xmlns:wp="http://schemas.openxmlformats.org/drawingml/2006/wordprocessingDrawing" xmlns:w10="urn:schemas-microsoft-com:office:word" xmlns:w="http://schemas.openxmlformats.org/wordprocessingml/2006/main" xmlns:w14="http://schemas.microsoft.com/office/word/2010/wordml" xmlns:w15="http://schemas.microsoft.com/office/word/2012/wordml" xmlns:w16cei="http://schemas.microsoft.com/office/word/2026/wordml/cei" xmlns:w16cex="http://schemas.microsoft.com/office/word/2018/wordml/cex" xmlns:w16cid="http://schemas.microsoft.com/office/word/2016/wordml/cid" xmlns:w16="http://schemas.microsoft.com/office/word/2018/wordml" xmlns:w16du="http://schemas.microsoft.com/office/word/2023/wordml/word16du" xmlns:w16sdtdh="http://schemas.microsoft.com/office/word/2020/wordml/sdtdatahash" xmlns:w16sdtfl="http://schemas.microsoft.com/office/word/2024/wordml/sdtformatlock" xmlns:w16se="http://schemas.microsoft.com/office/word/2015/wordml/symex" xmlns:wpg="http://schemas.microsoft.com/office/word/2010/wordprocessingGroup" xmlns:wpi="http://schemas.microsoft.com/office/word/2010/wordprocessingInk" xmlns:wne="http://schemas.microsoft.com/office/word/2006/wordml" xmlns:wps="http://schemas.microsoft.com/office/word/2010/wordprocessingShape" mc:Ignorable="w14 w15 w16se w16cid w16 w16cex w16sdtdh w16sdtfl w16du wp14">
+<w:footnotes xmlns:wpc="http://schemas.microsoft.com/office/word/2010/wordprocessingCanvas" xmlns:cx="http://schemas.microsoft.com/office/drawing/2014/chartex" xmlns:cx1="http://schemas.microsoft.com/office/drawing/2015/9/8/chartex" xmlns:cx2="http://schemas.microsoft.com/office/drawing/2015/10/21/chartex" xmlns:cx3="http://schemas.microsoft.com/office/drawing/2016/5/9/chartex" xmlns:cx4="http://schemas.microsoft.com/office/drawing/2016/5/10/chartex" xmlns:cx5="http://schemas.microsoft.com/office/drawing/2016/5/11/chartex" xmlns:cx6="http://schemas.microsoft.com/office/drawing/2016/5/12/chartex" xmlns:cx7="http://schemas.microsoft.com/office/drawing/2016/5/13/chartex" xmlns:cx8="http://schemas.microsoft.com/office/drawing/2016/5/14/chartex" xmlns:mc="http://schemas.openxmlformats.org/markup-compatibility/2006" xmlns:aink="http://schemas.microsoft.com/office/drawing/2016/ink" xmlns:am3d="http://schemas.microsoft.com/office/drawing/2017/model3d" xmlns:o="urn:schemas-microsoft-com:office:office" xmlns:oel="http://schemas.microsoft.com/office/2019/extlst" xmlns:r="http://schemas.openxmlformats.org/officeDocument/2006/relationships" xmlns:m="http://schemas.openxmlformats.org/officeDocument/2006/math" xmlns:v="urn:schemas-microsoft-com:vml" xmlns:wp14="http://schemas.microsoft.com/office/word/2010/wordprocessingDrawing" xmlns:wp="http://schemas.openxmlformats.org/drawingml/2006/wordprocessingDrawing" xmlns:w10="urn:schemas-microsoft-com:office:word" xmlns:w="http://schemas.openxmlformats.org/wordprocessingml/2006/main" xmlns:w14="http://schemas.microsoft.com/office/word/2010/wordml" xmlns:w15="http://schemas.microsoft.com/office/word/2012/wordml" xmlns:w16cex="http://schemas.microsoft.com/office/word/2018/wordml/cex" xmlns:w16cid="http://schemas.microsoft.com/office/word/2016/wordml/cid" xmlns:w16="http://schemas.microsoft.com/office/word/2018/wordml" xmlns:w16du="http://schemas.microsoft.com/office/word/2023/wordml/word16du" xmlns:w16sdtdh="http://schemas.microsoft.com/office/word/2020/wordml/sdtdatahash" xmlns:w16sdtfl="http://schemas.microsoft.com/office/word/2024/wordml/sdtformatlock" xmlns:w16se="http://schemas.microsoft.com/office/word/2015/wordml/symex" xmlns:wpg="http://schemas.microsoft.com/office/word/2010/wordprocessingGroup" xmlns:wpi="http://schemas.microsoft.com/office/word/2010/wordprocessingInk" xmlns:wne="http://schemas.microsoft.com/office/word/2006/wordml" xmlns:wps="http://schemas.microsoft.com/office/word/2010/wordprocessingShape" mc:Ignorable="w14 w15 w16se w16cid w16 w16cex w16sdtdh w16sdtfl w16du wp14">
   <w:footnote w:type="separator" w:id="-1">
     <w:p>
       <w:r>
@@ -4407,7 +2974,7 @@
 </file>
 
 <file path=word/header1.xml><?xml version="1.0" encoding="utf-8"?>
-<w:hdr xmlns:wpc="http://schemas.microsoft.com/office/word/2010/wordprocessingCanvas" xmlns:cx="http://schemas.microsoft.com/office/drawing/2014/chartex" xmlns:cx1="http://schemas.microsoft.com/office/drawing/2015/9/8/chartex" xmlns:cx2="http://schemas.microsoft.com/office/drawing/2015/10/21/chartex" xmlns:cx3="http://schemas.microsoft.com/office/drawing/2016/5/9/chartex" xmlns:cx4="http://schemas.microsoft.com/office/drawing/2016/5/10/chartex" xmlns:cx5="http://schemas.microsoft.com/office/drawing/2016/5/11/chartex" xmlns:cx6="http://schemas.microsoft.com/office/drawing/2016/5/12/chartex" xmlns:cx7="http://schemas.microsoft.com/office/drawing/2016/5/13/chartex" xmlns:cx8="http://schemas.microsoft.com/office/drawing/2016/5/14/chartex" xmlns:mc="http://schemas.openxmlformats.org/markup-compatibility/2006" xmlns:aink="http://schemas.microsoft.com/office/drawing/2016/ink" xmlns:am3d="http://schemas.microsoft.com/office/drawing/2017/model3d" xmlns:o="urn:schemas-microsoft-com:office:office" xmlns:oel="http://schemas.microsoft.com/office/2019/extlst" xmlns:r="http://schemas.openxmlformats.org/officeDocument/2006/relationships" xmlns:m="http://schemas.openxmlformats.org/officeDocument/2006/math" xmlns:v="urn:schemas-microsoft-com:vml" xmlns:wp14="http://schemas.microsoft.com/office/word/2010/wordprocessingDrawing" xmlns:wp="http://schemas.openxmlformats.org/drawingml/2006/wordprocessingDrawing" xmlns:w10="urn:schemas-microsoft-com:office:word" xmlns:w="http://schemas.openxmlformats.org/wordprocessingml/2006/main" xmlns:w14="http://schemas.microsoft.com/office/word/2010/wordml" xmlns:w15="http://schemas.microsoft.com/office/word/2012/wordml" xmlns:w16cei="http://schemas.microsoft.com/office/word/2026/wordml/cei" xmlns:w16cex="http://schemas.microsoft.com/office/word/2018/wordml/cex" xmlns:w16cid="http://schemas.microsoft.com/office/word/2016/wordml/cid" xmlns:w16="http://schemas.microsoft.com/office/word/2018/wordml" xmlns:w16du="http://schemas.microsoft.com/office/word/2023/wordml/word16du" xmlns:w16sdtdh="http://schemas.microsoft.com/office/word/2020/wordml/sdtdatahash" xmlns:w16sdtfl="http://schemas.microsoft.com/office/word/2024/wordml/sdtformatlock" xmlns:w16se="http://schemas.microsoft.com/office/word/2015/wordml/symex" xmlns:wpg="http://schemas.microsoft.com/office/word/2010/wordprocessingGroup" xmlns:wpi="http://schemas.microsoft.com/office/word/2010/wordprocessingInk" xmlns:wne="http://schemas.microsoft.com/office/word/2006/wordml" xmlns:wps="http://schemas.microsoft.com/office/word/2010/wordprocessingShape" mc:Ignorable="w14 w15 w16se w16cid w16 w16cex w16sdtdh w16sdtfl w16du wp14">
+<w:hdr xmlns:wpc="http://schemas.microsoft.com/office/word/2010/wordprocessingCanvas" xmlns:cx="http://schemas.microsoft.com/office/drawing/2014/chartex" xmlns:cx1="http://schemas.microsoft.com/office/drawing/2015/9/8/chartex" xmlns:cx2="http://schemas.microsoft.com/office/drawing/2015/10/21/chartex" xmlns:cx3="http://schemas.microsoft.com/office/drawing/2016/5/9/chartex" xmlns:cx4="http://schemas.microsoft.com/office/drawing/2016/5/10/chartex" xmlns:cx5="http://schemas.microsoft.com/office/drawing/2016/5/11/chartex" xmlns:cx6="http://schemas.microsoft.com/office/drawing/2016/5/12/chartex" xmlns:cx7="http://schemas.microsoft.com/office/drawing/2016/5/13/chartex" xmlns:cx8="http://schemas.microsoft.com/office/drawing/2016/5/14/chartex" xmlns:mc="http://schemas.openxmlformats.org/markup-compatibility/2006" xmlns:aink="http://schemas.microsoft.com/office/drawing/2016/ink" xmlns:am3d="http://schemas.microsoft.com/office/drawing/2017/model3d" xmlns:o="urn:schemas-microsoft-com:office:office" xmlns:oel="http://schemas.microsoft.com/office/2019/extlst" xmlns:r="http://schemas.openxmlformats.org/officeDocument/2006/relationships" xmlns:m="http://schemas.openxmlformats.org/officeDocument/2006/math" xmlns:v="urn:schemas-microsoft-com:vml" xmlns:wp14="http://schemas.microsoft.com/office/word/2010/wordprocessingDrawing" xmlns:wp="http://schemas.openxmlformats.org/drawingml/2006/wordprocessingDrawing" xmlns:w10="urn:schemas-microsoft-com:office:word" xmlns:w="http://schemas.openxmlformats.org/wordprocessingml/2006/main" xmlns:w14="http://schemas.microsoft.com/office/word/2010/wordml" xmlns:w15="http://schemas.microsoft.com/office/word/2012/wordml" xmlns:w16cex="http://schemas.microsoft.com/office/word/2018/wordml/cex" xmlns:w16cid="http://schemas.microsoft.com/office/word/2016/wordml/cid" xmlns:w16="http://schemas.microsoft.com/office/word/2018/wordml" xmlns:w16du="http://schemas.microsoft.com/office/word/2023/wordml/word16du" xmlns:w16sdtdh="http://schemas.microsoft.com/office/word/2020/wordml/sdtdatahash" xmlns:w16sdtfl="http://schemas.microsoft.com/office/word/2024/wordml/sdtformatlock" xmlns:w16se="http://schemas.microsoft.com/office/word/2015/wordml/symex" xmlns:wpg="http://schemas.microsoft.com/office/word/2010/wordprocessingGroup" xmlns:wpi="http://schemas.microsoft.com/office/word/2010/wordprocessingInk" xmlns:wne="http://schemas.microsoft.com/office/word/2006/wordml" xmlns:wps="http://schemas.microsoft.com/office/word/2010/wordprocessingShape" mc:Ignorable="w14 w15 w16se w16cid w16 w16cex w16sdtdh w16sdtfl w16du wp14">
   <w:p>
     <w:pPr>
       <w:pStyle w:val="Header"/>
@@ -4492,7 +3059,7 @@
             </wp:anchor>
           </w:drawing>
         </mc:Choice>
-        <mc:Fallback>
+        <mc:Fallback xmlns:w16cei="http://schemas.microsoft.com/office/word/2026/wordml/cei">
           <w:pict>
             <v:rect id="shape_0" ID="Rectangle 7" fillcolor="white" stroked="f" style="position:absolute;margin-left:23.1pt;margin-top:493.5pt;width:568.5pt;height:20.9pt;mso-position-horizontal-relative:page;mso-position-vertical-relative:page" wp14:anchorId="772952EF">
               <w10:wrap type="none"/>
@@ -4694,7 +3261,7 @@
             </wp:anchor>
           </w:drawing>
         </mc:Choice>
-        <mc:Fallback>
+        <mc:Fallback xmlns:w16cei="http://schemas.microsoft.com/office/word/2026/wordml/cei">
           <w:pict>
             <v:line id="shape_0" from="31.05pt,90pt" to="599.5pt,90pt" ID="Line 6" stroked="t" style="position:absolute;mso-position-horizontal-relative:page;mso-position-vertical-relative:page" wp14:anchorId="76EB4E65">
               <v:stroke color="black" weight="28440" joinstyle="round" endcap="flat"/>
@@ -4717,7 +3284,7 @@
 </file>
 
 <file path=word/numbering.xml><?xml version="1.0" encoding="utf-8"?>
-<w:numbering xmlns:wpc="http://schemas.microsoft.com/office/word/2010/wordprocessingCanvas" xmlns:cx="http://schemas.microsoft.com/office/drawing/2014/chartex" xmlns:cx1="http://schemas.microsoft.com/office/drawing/2015/9/8/chartex" xmlns:cx2="http://schemas.microsoft.com/office/drawing/2015/10/21/chartex" xmlns:cx3="http://schemas.microsoft.com/office/drawing/2016/5/9/chartex" xmlns:cx4="http://schemas.microsoft.com/office/drawing/2016/5/10/chartex" xmlns:cx5="http://schemas.microsoft.com/office/drawing/2016/5/11/chartex" xmlns:cx6="http://schemas.microsoft.com/office/drawing/2016/5/12/chartex" xmlns:cx7="http://schemas.microsoft.com/office/drawing/2016/5/13/chartex" xmlns:cx8="http://schemas.microsoft.com/office/drawing/2016/5/14/chartex" xmlns:mc="http://schemas.openxmlformats.org/markup-compatibility/2006" xmlns:aink="http://schemas.microsoft.com/office/drawing/2016/ink" xmlns:am3d="http://schemas.microsoft.com/office/drawing/2017/model3d" xmlns:o="urn:schemas-microsoft-com:office:office" xmlns:oel="http://schemas.microsoft.com/office/2019/extlst" xmlns:r="http://schemas.openxmlformats.org/officeDocument/2006/relationships" xmlns:m="http://schemas.openxmlformats.org/officeDocument/2006/math" xmlns:v="urn:schemas-microsoft-com:vml" xmlns:wp14="http://schemas.microsoft.com/office/word/2010/wordprocessingDrawing" xmlns:wp="http://schemas.openxmlformats.org/drawingml/2006/wordprocessingDrawing" xmlns:w10="urn:schemas-microsoft-com:office:word" xmlns:w="http://schemas.openxmlformats.org/wordprocessingml/2006/main" xmlns:w14="http://schemas.microsoft.com/office/word/2010/wordml" xmlns:w15="http://schemas.microsoft.com/office/word/2012/wordml" xmlns:w16cei="http://schemas.microsoft.com/office/word/2026/wordml/cei" xmlns:w16cex="http://schemas.microsoft.com/office/word/2018/wordml/cex" xmlns:w16cid="http://schemas.microsoft.com/office/word/2016/wordml/cid" xmlns:w16="http://schemas.microsoft.com/office/word/2018/wordml" xmlns:w16du="http://schemas.microsoft.com/office/word/2023/wordml/word16du" xmlns:w16sdtdh="http://schemas.microsoft.com/office/word/2020/wordml/sdtdatahash" xmlns:w16sdtfl="http://schemas.microsoft.com/office/word/2024/wordml/sdtformatlock" xmlns:w16se="http://schemas.microsoft.com/office/word/2015/wordml/symex" xmlns:wpg="http://schemas.microsoft.com/office/word/2010/wordprocessingGroup" xmlns:wpi="http://schemas.microsoft.com/office/word/2010/wordprocessingInk" xmlns:wne="http://schemas.microsoft.com/office/word/2006/wordml" xmlns:wps="http://schemas.microsoft.com/office/word/2010/wordprocessingShape" mc:Ignorable="w14 w15 w16se w16cid w16 w16cex w16sdtdh w16sdtfl w16du wp14">
+<w:numbering xmlns:wpc="http://schemas.microsoft.com/office/word/2010/wordprocessingCanvas" xmlns:cx="http://schemas.microsoft.com/office/drawing/2014/chartex" xmlns:cx1="http://schemas.microsoft.com/office/drawing/2015/9/8/chartex" xmlns:cx2="http://schemas.microsoft.com/office/drawing/2015/10/21/chartex" xmlns:cx3="http://schemas.microsoft.com/office/drawing/2016/5/9/chartex" xmlns:cx4="http://schemas.microsoft.com/office/drawing/2016/5/10/chartex" xmlns:cx5="http://schemas.microsoft.com/office/drawing/2016/5/11/chartex" xmlns:cx6="http://schemas.microsoft.com/office/drawing/2016/5/12/chartex" xmlns:cx7="http://schemas.microsoft.com/office/drawing/2016/5/13/chartex" xmlns:cx8="http://schemas.microsoft.com/office/drawing/2016/5/14/chartex" xmlns:mc="http://schemas.openxmlformats.org/markup-compatibility/2006" xmlns:aink="http://schemas.microsoft.com/office/drawing/2016/ink" xmlns:am3d="http://schemas.microsoft.com/office/drawing/2017/model3d" xmlns:o="urn:schemas-microsoft-com:office:office" xmlns:oel="http://schemas.microsoft.com/office/2019/extlst" xmlns:r="http://schemas.openxmlformats.org/officeDocument/2006/relationships" xmlns:m="http://schemas.openxmlformats.org/officeDocument/2006/math" xmlns:v="urn:schemas-microsoft-com:vml" xmlns:wp14="http://schemas.microsoft.com/office/word/2010/wordprocessingDrawing" xmlns:wp="http://schemas.openxmlformats.org/drawingml/2006/wordprocessingDrawing" xmlns:w10="urn:schemas-microsoft-com:office:word" xmlns:w="http://schemas.openxmlformats.org/wordprocessingml/2006/main" xmlns:w14="http://schemas.microsoft.com/office/word/2010/wordml" xmlns:w15="http://schemas.microsoft.com/office/word/2012/wordml" xmlns:w16cex="http://schemas.microsoft.com/office/word/2018/wordml/cex" xmlns:w16cid="http://schemas.microsoft.com/office/word/2016/wordml/cid" xmlns:w16="http://schemas.microsoft.com/office/word/2018/wordml" xmlns:w16du="http://schemas.microsoft.com/office/word/2023/wordml/word16du" xmlns:w16sdtdh="http://schemas.microsoft.com/office/word/2020/wordml/sdtdatahash" xmlns:w16sdtfl="http://schemas.microsoft.com/office/word/2024/wordml/sdtformatlock" xmlns:w16se="http://schemas.microsoft.com/office/word/2015/wordml/symex" xmlns:wpg="http://schemas.microsoft.com/office/word/2010/wordprocessingGroup" xmlns:wpi="http://schemas.microsoft.com/office/word/2010/wordprocessingInk" xmlns:wne="http://schemas.microsoft.com/office/word/2006/wordml" xmlns:wps="http://schemas.microsoft.com/office/word/2010/wordprocessingShape" mc:Ignorable="w14 w15 w16se w16cid w16 w16cex w16sdtdh w16sdtfl w16du wp14">
   <w:abstractNum w:abstractNumId="0" w15:restartNumberingAfterBreak="0">
     <w:nsid w:val="575D4E64"/>
     <w:multiLevelType w:val="multilevel"/>
@@ -5440,6 +4007,7 @@
   <w:style w:type="character" w:default="1" w:styleId="DefaultParagraphFont">
     <w:name w:val="Default Paragraph Font"/>
     <w:uiPriority w:val="1"/>
+    <w:semiHidden/>
     <w:unhideWhenUsed/>
   </w:style>
   <w:style w:type="table" w:default="1" w:styleId="TableNormal">

</xml_diff>

<commit_message>
codigos iniciales de clase
</commit_message>
<xml_diff>
--- a/DVVDS/T2.0/T2.0.docx
+++ b/DVVDS/T2.0/T2.0.docx
@@ -816,6 +816,95 @@
           <w:rFonts w:ascii="Arial" w:hAnsi="Arial" w:cs="Arial"/>
           <w:sz w:val="20"/>
           <w:szCs w:val="20"/>
+          <w:lang w:eastAsia="en-US"/>
+        </w:rPr>
+      </w:pPr>
+      <w:r>
+        <w:rPr>
+          <w:rFonts w:ascii="Arial" w:hAnsi="Arial" w:cs="Arial"/>
+          <w:sz w:val="20"/>
+          <w:szCs w:val="20"/>
+          <w:lang w:eastAsia="en-US"/>
+        </w:rPr>
+        <w:t>Numero de estudiante: 745984 en b</w:t>
+      </w:r>
+      <w:r>
+        <w:rPr>
+          <w:rFonts w:ascii="Arial" w:hAnsi="Arial" w:cs="Arial"/>
+          <w:sz w:val="20"/>
+          <w:szCs w:val="20"/>
+          <w:lang w:eastAsia="en-US"/>
+        </w:rPr>
+        <w:t xml:space="preserve">inario es </w:t>
+      </w:r>
+      <w:r>
+        <w:rPr>
+          <w:rFonts w:ascii="Arial" w:hAnsi="Arial" w:cs="Arial"/>
+          <w:sz w:val="20"/>
+          <w:szCs w:val="20"/>
+          <w:highlight w:val="yellow"/>
+          <w:lang w:eastAsia="en-US"/>
+        </w:rPr>
+        <w:t>1011 0110 0010 0000 0000</w:t>
+      </w:r>
+    </w:p>
+    <w:p>
+      <w:pPr>
+        <w:jc w:val="center"/>
+        <w:rPr>
+          <w:rFonts w:ascii="Arial" w:hAnsi="Arial" w:cs="Arial"/>
+          <w:sz w:val="20"/>
+          <w:szCs w:val="20"/>
+          <w:lang w:val="en-US" w:eastAsia="en-US"/>
+        </w:rPr>
+      </w:pPr>
+      <w:r>
+        <w:rPr>
+          <w:noProof/>
+        </w:rPr>
+        <w:drawing>
+          <wp:inline distT="0" distB="0" distL="0" distR="0" wp14:anchorId="0812BF69" wp14:editId="368FFC0F">
+            <wp:extent cx="4476750" cy="1421317"/>
+            <wp:effectExtent l="0" t="0" r="0" b="7620"/>
+            <wp:docPr id="968602947" name="Picture 1"/>
+            <wp:cNvGraphicFramePr>
+              <a:graphicFrameLocks xmlns:a="http://schemas.openxmlformats.org/drawingml/2006/main" noChangeAspect="1"/>
+            </wp:cNvGraphicFramePr>
+            <a:graphic xmlns:a="http://schemas.openxmlformats.org/drawingml/2006/main">
+              <a:graphicData uri="http://schemas.openxmlformats.org/drawingml/2006/picture">
+                <pic:pic xmlns:pic="http://schemas.openxmlformats.org/drawingml/2006/picture">
+                  <pic:nvPicPr>
+                    <pic:cNvPr id="968602947" name=""/>
+                    <pic:cNvPicPr/>
+                  </pic:nvPicPr>
+                  <pic:blipFill>
+                    <a:blip r:embed="rId10"/>
+                    <a:stretch>
+                      <a:fillRect/>
+                    </a:stretch>
+                  </pic:blipFill>
+                  <pic:spPr>
+                    <a:xfrm>
+                      <a:off x="0" y="0"/>
+                      <a:ext cx="4488450" cy="1425031"/>
+                    </a:xfrm>
+                    <a:prstGeom prst="rect">
+                      <a:avLst/>
+                    </a:prstGeom>
+                  </pic:spPr>
+                </pic:pic>
+              </a:graphicData>
+            </a:graphic>
+          </wp:inline>
+        </w:drawing>
+      </w:r>
+    </w:p>
+    <w:p>
+      <w:pPr>
+        <w:rPr>
+          <w:rFonts w:ascii="Arial" w:hAnsi="Arial" w:cs="Arial"/>
+          <w:sz w:val="20"/>
+          <w:szCs w:val="20"/>
           <w:lang w:val="en-US" w:eastAsia="en-US"/>
         </w:rPr>
       </w:pPr>
@@ -2632,6 +2721,7 @@
           <w:iCs/>
           <w:sz w:val="20"/>
           <w:szCs w:val="20"/>
+          <w:lang w:val="en-US"/>
         </w:rPr>
       </w:pPr>
     </w:p>
@@ -2773,8 +2863,8 @@
       </w:r>
     </w:p>
     <w:sectPr>
-      <w:headerReference w:type="default" r:id="rId10"/>
-      <w:footerReference w:type="default" r:id="rId11"/>
+      <w:headerReference w:type="default" r:id="rId11"/>
+      <w:footerReference w:type="default" r:id="rId12"/>
       <w:pgSz w:w="12240" w:h="15840"/>
       <w:pgMar w:top="431" w:right="284" w:bottom="431" w:left="680" w:header="0" w:footer="340" w:gutter="0"/>
       <w:cols w:space="720"/>

</xml_diff>

<commit_message>
cambio de logic a wire para que no me diera problema el mux, y añadido de casos prueba en el top.
</commit_message>
<xml_diff>
--- a/DVVDS/T2.0/T2.0.docx
+++ b/DVVDS/T2.0/T2.0.docx
@@ -97,27 +97,7 @@
           <w:szCs w:val="20"/>
           <w:lang w:val="en-US" w:eastAsia="en-US"/>
         </w:rPr>
-        <w:t xml:space="preserve">Complete the design shown in picture 1. Then complete the pin planner and all processes needed to get the </w:t>
-      </w:r>
-      <w:proofErr w:type="spellStart"/>
-      <w:r>
-        <w:rPr>
-          <w:rFonts w:ascii="Arial" w:hAnsi="Arial" w:cs="Arial"/>
-          <w:sz w:val="20"/>
-          <w:szCs w:val="20"/>
-          <w:lang w:val="en-US" w:eastAsia="en-US"/>
-        </w:rPr>
-        <w:t>sof</w:t>
-      </w:r>
-      <w:proofErr w:type="spellEnd"/>
-      <w:r>
-        <w:rPr>
-          <w:rFonts w:ascii="Arial" w:hAnsi="Arial" w:cs="Arial"/>
-          <w:sz w:val="20"/>
-          <w:szCs w:val="20"/>
-          <w:lang w:val="en-US" w:eastAsia="en-US"/>
-        </w:rPr>
-        <w:t xml:space="preserve"> file and download it to the FPGA. </w:t>
+        <w:t xml:space="preserve">Complete the design shown in picture 1. Then complete the pin planner and all processes needed to get the sof file and download it to the FPGA. </w:t>
       </w:r>
       <w:r>
         <w:rPr>
@@ -126,9 +106,8 @@
           <w:szCs w:val="20"/>
           <w:lang w:eastAsia="en-US"/>
         </w:rPr>
-        <w:t xml:space="preserve">Test </w:t>
-      </w:r>
-      <w:proofErr w:type="spellStart"/>
+        <w:t>Test i</w:t>
+      </w:r>
       <w:r>
         <w:rPr>
           <w:rFonts w:ascii="Arial" w:hAnsi="Arial" w:cs="Arial"/>
@@ -136,7 +115,7 @@
           <w:szCs w:val="20"/>
           <w:lang w:eastAsia="en-US"/>
         </w:rPr>
-        <w:t>i</w:t>
+        <w:t>t</w:t>
       </w:r>
       <w:r>
         <w:rPr>
@@ -145,57 +124,7 @@
           <w:szCs w:val="20"/>
           <w:lang w:eastAsia="en-US"/>
         </w:rPr>
-        <w:t>t</w:t>
-      </w:r>
-      <w:proofErr w:type="spellEnd"/>
-      <w:r>
-        <w:rPr>
-          <w:rFonts w:ascii="Arial" w:hAnsi="Arial" w:cs="Arial"/>
-          <w:sz w:val="20"/>
-          <w:szCs w:val="20"/>
-          <w:lang w:eastAsia="en-US"/>
-        </w:rPr>
-        <w:t xml:space="preserve"> as </w:t>
-      </w:r>
-      <w:proofErr w:type="spellStart"/>
-      <w:r>
-        <w:rPr>
-          <w:rFonts w:ascii="Arial" w:hAnsi="Arial" w:cs="Arial"/>
-          <w:sz w:val="20"/>
-          <w:szCs w:val="20"/>
-          <w:lang w:eastAsia="en-US"/>
-        </w:rPr>
-        <w:t>shown</w:t>
-      </w:r>
-      <w:proofErr w:type="spellEnd"/>
-      <w:r>
-        <w:rPr>
-          <w:rFonts w:ascii="Arial" w:hAnsi="Arial" w:cs="Arial"/>
-          <w:sz w:val="20"/>
-          <w:szCs w:val="20"/>
-          <w:lang w:eastAsia="en-US"/>
-        </w:rPr>
-        <w:t xml:space="preserve"> in </w:t>
-      </w:r>
-      <w:proofErr w:type="spellStart"/>
-      <w:r>
-        <w:rPr>
-          <w:rFonts w:ascii="Arial" w:hAnsi="Arial" w:cs="Arial"/>
-          <w:sz w:val="20"/>
-          <w:szCs w:val="20"/>
-          <w:lang w:eastAsia="en-US"/>
-        </w:rPr>
-        <w:t>picture</w:t>
-      </w:r>
-      <w:proofErr w:type="spellEnd"/>
-      <w:r>
-        <w:rPr>
-          <w:rFonts w:ascii="Arial" w:hAnsi="Arial" w:cs="Arial"/>
-          <w:sz w:val="20"/>
-          <w:szCs w:val="20"/>
-          <w:lang w:eastAsia="en-US"/>
-        </w:rPr>
-        <w:t xml:space="preserve"> 2:</w:t>
+        <w:t xml:space="preserve"> as shown in picture 2:</w:t>
       </w:r>
     </w:p>
     <w:p>
@@ -299,67 +228,7 @@
           <w:szCs w:val="20"/>
           <w:lang w:val="en-US" w:eastAsia="en-US"/>
         </w:rPr>
-        <w:t xml:space="preserve"> (</w:t>
-      </w:r>
-      <w:proofErr w:type="spellStart"/>
-      <w:r>
-        <w:rPr>
-          <w:rFonts w:ascii="Arial" w:hAnsi="Arial" w:cs="Arial"/>
-          <w:sz w:val="20"/>
-          <w:szCs w:val="20"/>
-          <w:lang w:val="en-US" w:eastAsia="en-US"/>
-        </w:rPr>
-        <w:t>A_in</w:t>
-      </w:r>
-      <w:proofErr w:type="spellEnd"/>
-      <w:r>
-        <w:rPr>
-          <w:rFonts w:ascii="Arial" w:hAnsi="Arial" w:cs="Arial"/>
-          <w:sz w:val="20"/>
-          <w:szCs w:val="20"/>
-          <w:lang w:val="en-US" w:eastAsia="en-US"/>
-        </w:rPr>
-        <w:t xml:space="preserve">, </w:t>
-      </w:r>
-      <w:proofErr w:type="spellStart"/>
-      <w:r>
-        <w:rPr>
-          <w:rFonts w:ascii="Arial" w:hAnsi="Arial" w:cs="Arial"/>
-          <w:sz w:val="20"/>
-          <w:szCs w:val="20"/>
-          <w:lang w:val="en-US" w:eastAsia="en-US"/>
-        </w:rPr>
-        <w:t>B_in</w:t>
-      </w:r>
-      <w:proofErr w:type="spellEnd"/>
-      <w:r>
-        <w:rPr>
-          <w:rFonts w:ascii="Arial" w:hAnsi="Arial" w:cs="Arial"/>
-          <w:sz w:val="20"/>
-          <w:szCs w:val="20"/>
-          <w:lang w:val="en-US" w:eastAsia="en-US"/>
-        </w:rPr>
-        <w:t xml:space="preserve"> and </w:t>
-      </w:r>
-      <w:proofErr w:type="gramStart"/>
-      <w:r>
-        <w:rPr>
-          <w:rFonts w:ascii="Arial" w:hAnsi="Arial" w:cs="Arial"/>
-          <w:sz w:val="20"/>
-          <w:szCs w:val="20"/>
-          <w:lang w:val="en-US" w:eastAsia="en-US"/>
-        </w:rPr>
-        <w:t>Disable</w:t>
-      </w:r>
-      <w:proofErr w:type="gramEnd"/>
-      <w:r>
-        <w:rPr>
-          <w:rFonts w:ascii="Arial" w:hAnsi="Arial" w:cs="Arial"/>
-          <w:sz w:val="20"/>
-          <w:szCs w:val="20"/>
-          <w:lang w:val="en-US" w:eastAsia="en-US"/>
-        </w:rPr>
-        <w:t>)</w:t>
+        <w:t xml:space="preserve"> (A_in, B_in and Disable)</w:t>
       </w:r>
       <w:r>
         <w:rPr>
@@ -542,45 +411,8 @@
           <w:szCs w:val="20"/>
           <w:lang w:eastAsia="en-US"/>
         </w:rPr>
-        <w:t xml:space="preserve">Module </w:t>
-      </w:r>
-      <w:proofErr w:type="spellStart"/>
-      <w:r>
-        <w:rPr>
-          <w:rFonts w:ascii="Arial" w:hAnsi="Arial" w:cs="Arial"/>
-          <w:i/>
-          <w:iCs/>
-          <w:sz w:val="20"/>
-          <w:szCs w:val="20"/>
-          <w:lang w:eastAsia="en-US"/>
-        </w:rPr>
-        <w:t>to</w:t>
-      </w:r>
-      <w:proofErr w:type="spellEnd"/>
-      <w:r>
-        <w:rPr>
-          <w:rFonts w:ascii="Arial" w:hAnsi="Arial" w:cs="Arial"/>
-          <w:i/>
-          <w:iCs/>
-          <w:sz w:val="20"/>
-          <w:szCs w:val="20"/>
-          <w:lang w:eastAsia="en-US"/>
-        </w:rPr>
-        <w:t xml:space="preserve"> be </w:t>
-      </w:r>
-      <w:proofErr w:type="spellStart"/>
-      <w:r>
-        <w:rPr>
-          <w:rFonts w:ascii="Arial" w:hAnsi="Arial" w:cs="Arial"/>
-          <w:i/>
-          <w:iCs/>
-          <w:sz w:val="20"/>
-          <w:szCs w:val="20"/>
-          <w:lang w:eastAsia="en-US"/>
-        </w:rPr>
-        <w:t>implemented</w:t>
-      </w:r>
-      <w:proofErr w:type="spellEnd"/>
+        <w:t>Module to be implemented</w:t>
+      </w:r>
     </w:p>
     <w:p>
       <w:pPr>
@@ -941,17 +773,8 @@
                 <w:sz w:val="20"/>
                 <w:szCs w:val="20"/>
               </w:rPr>
-              <w:t xml:space="preserve">Test </w:t>
-            </w:r>
-            <w:proofErr w:type="spellStart"/>
-            <w:r>
-              <w:rPr>
-                <w:sz w:val="20"/>
-                <w:szCs w:val="20"/>
-              </w:rPr>
-              <w:t>number</w:t>
-            </w:r>
-            <w:proofErr w:type="spellEnd"/>
+              <w:t>Test number</w:t>
+            </w:r>
           </w:p>
         </w:tc>
         <w:tc>
@@ -971,17 +794,8 @@
                 <w:sz w:val="20"/>
                 <w:szCs w:val="20"/>
               </w:rPr>
-              <w:t xml:space="preserve">A </w:t>
-            </w:r>
-            <w:proofErr w:type="spellStart"/>
-            <w:r>
-              <w:rPr>
-                <w:sz w:val="20"/>
-                <w:szCs w:val="20"/>
-              </w:rPr>
-              <w:t>value</w:t>
-            </w:r>
-            <w:proofErr w:type="spellEnd"/>
+              <w:t>A value</w:t>
+            </w:r>
           </w:p>
         </w:tc>
         <w:tc>
@@ -1001,17 +815,8 @@
                 <w:sz w:val="20"/>
                 <w:szCs w:val="20"/>
               </w:rPr>
-              <w:t xml:space="preserve">B </w:t>
-            </w:r>
-            <w:proofErr w:type="spellStart"/>
-            <w:r>
-              <w:rPr>
-                <w:sz w:val="20"/>
-                <w:szCs w:val="20"/>
-              </w:rPr>
-              <w:t>value</w:t>
-            </w:r>
-            <w:proofErr w:type="spellEnd"/>
+              <w:t>B value</w:t>
+            </w:r>
           </w:p>
         </w:tc>
         <w:tc>
@@ -1047,31 +852,13 @@
                 <w:szCs w:val="20"/>
               </w:rPr>
             </w:pPr>
-            <w:proofErr w:type="spellStart"/>
-            <w:r>
-              <w:rPr>
-                <w:sz w:val="20"/>
-                <w:szCs w:val="20"/>
-              </w:rPr>
-              <w:t>Expected</w:t>
-            </w:r>
-            <w:proofErr w:type="spellEnd"/>
-            <w:r>
-              <w:rPr>
-                <w:sz w:val="20"/>
-                <w:szCs w:val="20"/>
-              </w:rPr>
-              <w:t xml:space="preserve"> </w:t>
-            </w:r>
-            <w:proofErr w:type="spellStart"/>
-            <w:r>
-              <w:rPr>
-                <w:sz w:val="20"/>
-                <w:szCs w:val="20"/>
-              </w:rPr>
-              <w:t>result</w:t>
-            </w:r>
-            <w:proofErr w:type="spellEnd"/>
+            <w:r>
+              <w:rPr>
+                <w:sz w:val="20"/>
+                <w:szCs w:val="20"/>
+              </w:rPr>
+              <w:t>Expected result</w:t>
+            </w:r>
           </w:p>
         </w:tc>
         <w:tc>
@@ -1091,17 +878,8 @@
                 <w:sz w:val="20"/>
                 <w:szCs w:val="20"/>
               </w:rPr>
-              <w:t xml:space="preserve">Actual </w:t>
-            </w:r>
-            <w:proofErr w:type="spellStart"/>
-            <w:r>
-              <w:rPr>
-                <w:sz w:val="20"/>
-                <w:szCs w:val="20"/>
-              </w:rPr>
-              <w:t>result</w:t>
-            </w:r>
-            <w:proofErr w:type="spellEnd"/>
+              <w:t>Actual result</w:t>
+            </w:r>
           </w:p>
         </w:tc>
       </w:tr>
@@ -1144,23 +922,7 @@
                 <w:sz w:val="20"/>
                 <w:szCs w:val="20"/>
               </w:rPr>
-              <w:t>Bits 3:0 (</w:t>
-            </w:r>
-            <w:proofErr w:type="spellStart"/>
-            <w:r>
-              <w:rPr>
-                <w:sz w:val="20"/>
-                <w:szCs w:val="20"/>
-              </w:rPr>
-              <w:t>e.g</w:t>
-            </w:r>
-            <w:proofErr w:type="spellEnd"/>
-            <w:r>
-              <w:rPr>
-                <w:sz w:val="20"/>
-                <w:szCs w:val="20"/>
-              </w:rPr>
-              <w:t>. 1010)</w:t>
+              <w:t>Bits 3:0 (e.g. 1010)</w:t>
             </w:r>
           </w:p>
         </w:tc>
@@ -1181,23 +943,7 @@
                 <w:sz w:val="20"/>
                 <w:szCs w:val="20"/>
               </w:rPr>
-              <w:t>Bits 7:4 (</w:t>
-            </w:r>
-            <w:proofErr w:type="spellStart"/>
-            <w:r>
-              <w:rPr>
-                <w:sz w:val="20"/>
-                <w:szCs w:val="20"/>
-              </w:rPr>
-              <w:t>e.g</w:t>
-            </w:r>
-            <w:proofErr w:type="spellEnd"/>
-            <w:r>
-              <w:rPr>
-                <w:sz w:val="20"/>
-                <w:szCs w:val="20"/>
-              </w:rPr>
-              <w:t>. 0000)</w:t>
+              <w:t>Bits 7:4 (e.g. 0000)</w:t>
             </w:r>
           </w:p>
         </w:tc>
@@ -1255,6 +1001,13 @@
                 <w:szCs w:val="20"/>
               </w:rPr>
             </w:pPr>
+            <w:r>
+              <w:rPr>
+                <w:sz w:val="20"/>
+                <w:szCs w:val="20"/>
+              </w:rPr>
+              <w:t>0000</w:t>
+            </w:r>
           </w:p>
         </w:tc>
       </w:tr>
@@ -1311,23 +1064,7 @@
                 <w:sz w:val="20"/>
                 <w:szCs w:val="20"/>
               </w:rPr>
-              <w:t xml:space="preserve"> (</w:t>
-            </w:r>
-            <w:proofErr w:type="spellStart"/>
-            <w:r>
-              <w:rPr>
-                <w:sz w:val="20"/>
-                <w:szCs w:val="20"/>
-              </w:rPr>
-              <w:t>e.g</w:t>
-            </w:r>
-            <w:proofErr w:type="spellEnd"/>
-            <w:r>
-              <w:rPr>
-                <w:sz w:val="20"/>
-                <w:szCs w:val="20"/>
-              </w:rPr>
-              <w:t>. 10</w:t>
+              <w:t xml:space="preserve"> (e.g. 10</w:t>
             </w:r>
             <w:r>
               <w:rPr>
@@ -1390,23 +1127,7 @@
                 <w:sz w:val="20"/>
                 <w:szCs w:val="20"/>
               </w:rPr>
-              <w:t xml:space="preserve"> (</w:t>
-            </w:r>
-            <w:proofErr w:type="spellStart"/>
-            <w:r>
-              <w:rPr>
-                <w:sz w:val="20"/>
-                <w:szCs w:val="20"/>
-              </w:rPr>
-              <w:t>e.g</w:t>
-            </w:r>
-            <w:proofErr w:type="spellEnd"/>
-            <w:r>
-              <w:rPr>
-                <w:sz w:val="20"/>
-                <w:szCs w:val="20"/>
-              </w:rPr>
-              <w:t xml:space="preserve">. </w:t>
+              <w:t xml:space="preserve"> (e.g. </w:t>
             </w:r>
             <w:r>
               <w:rPr>
@@ -1548,23 +1269,7 @@
                 <w:sz w:val="20"/>
                 <w:szCs w:val="20"/>
               </w:rPr>
-              <w:t xml:space="preserve"> (</w:t>
-            </w:r>
-            <w:proofErr w:type="spellStart"/>
-            <w:r>
-              <w:rPr>
-                <w:sz w:val="20"/>
-                <w:szCs w:val="20"/>
-              </w:rPr>
-              <w:t>e.g</w:t>
-            </w:r>
-            <w:proofErr w:type="spellEnd"/>
-            <w:r>
-              <w:rPr>
-                <w:sz w:val="20"/>
-                <w:szCs w:val="20"/>
-              </w:rPr>
-              <w:t>. 1010)</w:t>
+              <w:t xml:space="preserve"> (e.g. 1010)</w:t>
             </w:r>
           </w:p>
         </w:tc>
@@ -1585,23 +1290,7 @@
                 <w:sz w:val="20"/>
                 <w:szCs w:val="20"/>
               </w:rPr>
-              <w:t>Bits 3:0 (</w:t>
-            </w:r>
-            <w:proofErr w:type="spellStart"/>
-            <w:r>
-              <w:rPr>
-                <w:sz w:val="20"/>
-                <w:szCs w:val="20"/>
-              </w:rPr>
-              <w:t>e.g</w:t>
-            </w:r>
-            <w:proofErr w:type="spellEnd"/>
-            <w:r>
-              <w:rPr>
-                <w:sz w:val="20"/>
-                <w:szCs w:val="20"/>
-              </w:rPr>
-              <w:t>. 1010)</w:t>
+              <w:t>Bits 3:0 (e.g. 1010)</w:t>
             </w:r>
           </w:p>
         </w:tc>
@@ -1701,23 +1390,7 @@
                 <w:sz w:val="20"/>
                 <w:szCs w:val="20"/>
               </w:rPr>
-              <w:t>Bits 7:4 (</w:t>
-            </w:r>
-            <w:proofErr w:type="spellStart"/>
-            <w:r>
-              <w:rPr>
-                <w:sz w:val="20"/>
-                <w:szCs w:val="20"/>
-              </w:rPr>
-              <w:t>e.g</w:t>
-            </w:r>
-            <w:proofErr w:type="spellEnd"/>
-            <w:r>
-              <w:rPr>
-                <w:sz w:val="20"/>
-                <w:szCs w:val="20"/>
-              </w:rPr>
-              <w:t>. 0000)</w:t>
+              <w:t>Bits 7:4 (e.g. 0000)</w:t>
             </w:r>
           </w:p>
         </w:tc>
@@ -1752,23 +1425,7 @@
                 <w:sz w:val="20"/>
                 <w:szCs w:val="20"/>
               </w:rPr>
-              <w:t xml:space="preserve"> (</w:t>
-            </w:r>
-            <w:proofErr w:type="spellStart"/>
-            <w:r>
-              <w:rPr>
-                <w:sz w:val="20"/>
-                <w:szCs w:val="20"/>
-              </w:rPr>
-              <w:t>e.g</w:t>
-            </w:r>
-            <w:proofErr w:type="spellEnd"/>
-            <w:r>
-              <w:rPr>
-                <w:sz w:val="20"/>
-                <w:szCs w:val="20"/>
-              </w:rPr>
-              <w:t>. 10</w:t>
+              <w:t xml:space="preserve"> (e.g. 10</w:t>
             </w:r>
             <w:r>
               <w:rPr>
@@ -1910,23 +1567,7 @@
                 <w:sz w:val="20"/>
                 <w:szCs w:val="20"/>
               </w:rPr>
-              <w:t xml:space="preserve"> (</w:t>
-            </w:r>
-            <w:proofErr w:type="spellStart"/>
-            <w:r>
-              <w:rPr>
-                <w:sz w:val="20"/>
-                <w:szCs w:val="20"/>
-              </w:rPr>
-              <w:t>e.g</w:t>
-            </w:r>
-            <w:proofErr w:type="spellEnd"/>
-            <w:r>
-              <w:rPr>
-                <w:sz w:val="20"/>
-                <w:szCs w:val="20"/>
-              </w:rPr>
-              <w:t xml:space="preserve">. </w:t>
+              <w:t xml:space="preserve"> (e.g. </w:t>
             </w:r>
             <w:r>
               <w:rPr>
@@ -1989,23 +1630,7 @@
                 <w:sz w:val="20"/>
                 <w:szCs w:val="20"/>
               </w:rPr>
-              <w:t xml:space="preserve"> (</w:t>
-            </w:r>
-            <w:proofErr w:type="spellStart"/>
-            <w:r>
-              <w:rPr>
-                <w:sz w:val="20"/>
-                <w:szCs w:val="20"/>
-              </w:rPr>
-              <w:t>e.g</w:t>
-            </w:r>
-            <w:proofErr w:type="spellEnd"/>
-            <w:r>
-              <w:rPr>
-                <w:sz w:val="20"/>
-                <w:szCs w:val="20"/>
-              </w:rPr>
-              <w:t>. 1010)</w:t>
+              <w:t xml:space="preserve"> (e.g. 1010)</w:t>
             </w:r>
           </w:p>
         </w:tc>
@@ -2105,23 +1730,7 @@
                 <w:sz w:val="20"/>
                 <w:szCs w:val="20"/>
               </w:rPr>
-              <w:t>Bits 3:0 (</w:t>
-            </w:r>
-            <w:proofErr w:type="spellStart"/>
-            <w:r>
-              <w:rPr>
-                <w:sz w:val="20"/>
-                <w:szCs w:val="20"/>
-              </w:rPr>
-              <w:t>e.g</w:t>
-            </w:r>
-            <w:proofErr w:type="spellEnd"/>
-            <w:r>
-              <w:rPr>
-                <w:sz w:val="20"/>
-                <w:szCs w:val="20"/>
-              </w:rPr>
-              <w:t>. 1010)</w:t>
+              <w:t>Bits 3:0 (e.g. 1010)</w:t>
             </w:r>
           </w:p>
         </w:tc>
@@ -2142,23 +1751,7 @@
                 <w:sz w:val="20"/>
                 <w:szCs w:val="20"/>
               </w:rPr>
-              <w:t>Bits 7:4 (</w:t>
-            </w:r>
-            <w:proofErr w:type="spellStart"/>
-            <w:r>
-              <w:rPr>
-                <w:sz w:val="20"/>
-                <w:szCs w:val="20"/>
-              </w:rPr>
-              <w:t>e.g</w:t>
-            </w:r>
-            <w:proofErr w:type="spellEnd"/>
-            <w:r>
-              <w:rPr>
-                <w:sz w:val="20"/>
-                <w:szCs w:val="20"/>
-              </w:rPr>
-              <w:t>. 0000)</w:t>
+              <w:t>Bits 7:4 (e.g. 0000)</w:t>
             </w:r>
           </w:p>
         </w:tc>
@@ -2272,23 +1865,7 @@
                 <w:sz w:val="20"/>
                 <w:szCs w:val="20"/>
               </w:rPr>
-              <w:t xml:space="preserve"> (</w:t>
-            </w:r>
-            <w:proofErr w:type="spellStart"/>
-            <w:r>
-              <w:rPr>
-                <w:sz w:val="20"/>
-                <w:szCs w:val="20"/>
-              </w:rPr>
-              <w:t>e.g</w:t>
-            </w:r>
-            <w:proofErr w:type="spellEnd"/>
-            <w:r>
-              <w:rPr>
-                <w:sz w:val="20"/>
-                <w:szCs w:val="20"/>
-              </w:rPr>
-              <w:t>. 10</w:t>
+              <w:t xml:space="preserve"> (e.g. 10</w:t>
             </w:r>
             <w:r>
               <w:rPr>
@@ -2351,23 +1928,7 @@
                 <w:sz w:val="20"/>
                 <w:szCs w:val="20"/>
               </w:rPr>
-              <w:t xml:space="preserve"> (</w:t>
-            </w:r>
-            <w:proofErr w:type="spellStart"/>
-            <w:r>
-              <w:rPr>
-                <w:sz w:val="20"/>
-                <w:szCs w:val="20"/>
-              </w:rPr>
-              <w:t>e.g</w:t>
-            </w:r>
-            <w:proofErr w:type="spellEnd"/>
-            <w:r>
-              <w:rPr>
-                <w:sz w:val="20"/>
-                <w:szCs w:val="20"/>
-              </w:rPr>
-              <w:t xml:space="preserve">. </w:t>
+              <w:t xml:space="preserve"> (e.g. </w:t>
             </w:r>
             <w:r>
               <w:rPr>
@@ -2509,23 +2070,7 @@
                 <w:sz w:val="20"/>
                 <w:szCs w:val="20"/>
               </w:rPr>
-              <w:t xml:space="preserve"> (</w:t>
-            </w:r>
-            <w:proofErr w:type="spellStart"/>
-            <w:r>
-              <w:rPr>
-                <w:sz w:val="20"/>
-                <w:szCs w:val="20"/>
-              </w:rPr>
-              <w:t>e.g</w:t>
-            </w:r>
-            <w:proofErr w:type="spellEnd"/>
-            <w:r>
-              <w:rPr>
-                <w:sz w:val="20"/>
-                <w:szCs w:val="20"/>
-              </w:rPr>
-              <w:t>. 1010)</w:t>
+              <w:t xml:space="preserve"> (e.g. 1010)</w:t>
             </w:r>
           </w:p>
         </w:tc>
@@ -2546,23 +2091,7 @@
                 <w:sz w:val="20"/>
                 <w:szCs w:val="20"/>
               </w:rPr>
-              <w:t>Bits 3:0 (</w:t>
-            </w:r>
-            <w:proofErr w:type="spellStart"/>
-            <w:r>
-              <w:rPr>
-                <w:sz w:val="20"/>
-                <w:szCs w:val="20"/>
-              </w:rPr>
-              <w:t>e.g</w:t>
-            </w:r>
-            <w:proofErr w:type="spellEnd"/>
-            <w:r>
-              <w:rPr>
-                <w:sz w:val="20"/>
-                <w:szCs w:val="20"/>
-              </w:rPr>
-              <w:t>. 1010)</w:t>
+              <w:t>Bits 3:0 (e.g. 1010)</w:t>
             </w:r>
           </w:p>
         </w:tc>
@@ -2667,9 +2196,8 @@
           <w:sz w:val="20"/>
           <w:szCs w:val="20"/>
         </w:rPr>
-        <w:t xml:space="preserve">Leds que </w:t>
-      </w:r>
-      <w:proofErr w:type="spellStart"/>
+        <w:t>Leds que utlic</w:t>
+      </w:r>
       <w:r>
         <w:rPr>
           <w:rFonts w:ascii="Arial" w:hAnsi="Arial" w:cs="Arial"/>
@@ -2678,9 +2206,11 @@
           <w:sz w:val="20"/>
           <w:szCs w:val="20"/>
         </w:rPr>
-        <w:t>utlic</w:t>
-      </w:r>
-      <w:r>
+        <w:t>é para representar el resultado</w:t>
+      </w:r>
+    </w:p>
+    <w:p>
+      <w:pPr>
         <w:rPr>
           <w:rFonts w:ascii="Arial" w:hAnsi="Arial" w:cs="Arial"/>
           <w:i/>
@@ -2688,10 +2218,10 @@
           <w:sz w:val="20"/>
           <w:szCs w:val="20"/>
         </w:rPr>
-        <w:t>é</w:t>
-      </w:r>
-      <w:proofErr w:type="spellEnd"/>
-      <w:r>
+      </w:pPr>
+    </w:p>
+    <w:p>
+      <w:pPr>
         <w:rPr>
           <w:rFonts w:ascii="Arial" w:hAnsi="Arial" w:cs="Arial"/>
           <w:i/>
@@ -2699,8 +2229,7 @@
           <w:sz w:val="20"/>
           <w:szCs w:val="20"/>
         </w:rPr>
-        <w:t xml:space="preserve"> para representar el resultado</w:t>
-      </w:r>
+      </w:pPr>
     </w:p>
     <w:p>
       <w:pPr>
@@ -2721,12 +2250,9 @@
           <w:iCs/>
           <w:sz w:val="20"/>
           <w:szCs w:val="20"/>
-          <w:lang w:val="en-US"/>
-        </w:rPr>
-      </w:pPr>
-    </w:p>
-    <w:p>
-      <w:pPr>
+        </w:rPr>
+      </w:pPr>
+      <w:r>
         <w:rPr>
           <w:rFonts w:ascii="Arial" w:hAnsi="Arial" w:cs="Arial"/>
           <w:i/>
@@ -2734,6 +2260,227 @@
           <w:sz w:val="20"/>
           <w:szCs w:val="20"/>
         </w:rPr>
+        <w:t xml:space="preserve">RTL viewer: </w:t>
+      </w:r>
+    </w:p>
+    <w:p>
+      <w:pPr>
+        <w:rPr>
+          <w:rFonts w:ascii="Arial" w:hAnsi="Arial" w:cs="Arial"/>
+          <w:i/>
+          <w:iCs/>
+          <w:sz w:val="20"/>
+          <w:szCs w:val="20"/>
+        </w:rPr>
+      </w:pPr>
+      <w:r>
+        <w:rPr>
+          <w:rFonts w:ascii="Arial" w:hAnsi="Arial" w:cs="Arial"/>
+          <w:i/>
+          <w:iCs/>
+          <w:sz w:val="20"/>
+          <w:szCs w:val="20"/>
+        </w:rPr>
+        <w:drawing>
+          <wp:inline distT="0" distB="0" distL="0" distR="0" wp14:anchorId="227301C6" wp14:editId="2F87C80B">
+            <wp:extent cx="7160260" cy="2412365"/>
+            <wp:effectExtent l="0" t="0" r="2540" b="6985"/>
+            <wp:docPr id="1010968519" name="Picture 1"/>
+            <wp:cNvGraphicFramePr>
+              <a:graphicFrameLocks xmlns:a="http://schemas.openxmlformats.org/drawingml/2006/main" noChangeAspect="1"/>
+            </wp:cNvGraphicFramePr>
+            <a:graphic xmlns:a="http://schemas.openxmlformats.org/drawingml/2006/main">
+              <a:graphicData uri="http://schemas.openxmlformats.org/drawingml/2006/picture">
+                <pic:pic xmlns:pic="http://schemas.openxmlformats.org/drawingml/2006/picture">
+                  <pic:nvPicPr>
+                    <pic:cNvPr id="1010968519" name=""/>
+                    <pic:cNvPicPr/>
+                  </pic:nvPicPr>
+                  <pic:blipFill>
+                    <a:blip r:embed="rId11"/>
+                    <a:stretch>
+                      <a:fillRect/>
+                    </a:stretch>
+                  </pic:blipFill>
+                  <pic:spPr>
+                    <a:xfrm>
+                      <a:off x="0" y="0"/>
+                      <a:ext cx="7160260" cy="2412365"/>
+                    </a:xfrm>
+                    <a:prstGeom prst="rect">
+                      <a:avLst/>
+                    </a:prstGeom>
+                  </pic:spPr>
+                </pic:pic>
+              </a:graphicData>
+            </a:graphic>
+          </wp:inline>
+        </w:drawing>
+      </w:r>
+    </w:p>
+    <w:p>
+      <w:pPr>
+        <w:rPr>
+          <w:rFonts w:ascii="Arial" w:hAnsi="Arial" w:cs="Arial"/>
+          <w:i/>
+          <w:iCs/>
+          <w:sz w:val="20"/>
+          <w:szCs w:val="20"/>
+        </w:rPr>
+      </w:pPr>
+    </w:p>
+    <w:p>
+      <w:pPr>
+        <w:rPr>
+          <w:rFonts w:ascii="Arial" w:hAnsi="Arial" w:cs="Arial"/>
+          <w:i/>
+          <w:iCs/>
+          <w:sz w:val="20"/>
+          <w:szCs w:val="20"/>
+        </w:rPr>
+      </w:pPr>
+      <w:r>
+        <w:rPr>
+          <w:rFonts w:ascii="Arial" w:hAnsi="Arial" w:cs="Arial"/>
+          <w:i/>
+          <w:iCs/>
+          <w:sz w:val="20"/>
+          <w:szCs w:val="20"/>
+        </w:rPr>
+        <w:t xml:space="preserve">Test results: </w:t>
+      </w:r>
+    </w:p>
+    <w:p>
+      <w:pPr>
+        <w:rPr>
+          <w:rFonts w:ascii="Arial" w:hAnsi="Arial" w:cs="Arial"/>
+          <w:i/>
+          <w:iCs/>
+          <w:sz w:val="20"/>
+          <w:szCs w:val="20"/>
+        </w:rPr>
+      </w:pPr>
+    </w:p>
+    <w:p>
+      <w:pPr>
+        <w:rPr>
+          <w:rFonts w:ascii="Arial" w:hAnsi="Arial" w:cs="Arial"/>
+          <w:i/>
+          <w:iCs/>
+          <w:sz w:val="20"/>
+          <w:szCs w:val="20"/>
+        </w:rPr>
+      </w:pPr>
+    </w:p>
+    <w:p>
+      <w:pPr>
+        <w:rPr>
+          <w:rFonts w:ascii="Arial" w:hAnsi="Arial" w:cs="Arial"/>
+          <w:i/>
+          <w:iCs/>
+          <w:sz w:val="20"/>
+          <w:szCs w:val="20"/>
+        </w:rPr>
+      </w:pPr>
+    </w:p>
+    <w:p>
+      <w:pPr>
+        <w:rPr>
+          <w:rFonts w:ascii="Arial" w:hAnsi="Arial" w:cs="Arial"/>
+          <w:i/>
+          <w:iCs/>
+          <w:sz w:val="20"/>
+          <w:szCs w:val="20"/>
+        </w:rPr>
+      </w:pPr>
+    </w:p>
+    <w:p>
+      <w:pPr>
+        <w:rPr>
+          <w:rFonts w:ascii="Arial" w:hAnsi="Arial" w:cs="Arial"/>
+          <w:i/>
+          <w:iCs/>
+          <w:sz w:val="20"/>
+          <w:szCs w:val="20"/>
+        </w:rPr>
+      </w:pPr>
+    </w:p>
+    <w:p>
+      <w:pPr>
+        <w:rPr>
+          <w:rFonts w:ascii="Arial" w:hAnsi="Arial" w:cs="Arial"/>
+          <w:i/>
+          <w:iCs/>
+          <w:sz w:val="20"/>
+          <w:szCs w:val="20"/>
+        </w:rPr>
+      </w:pPr>
+    </w:p>
+    <w:p>
+      <w:pPr>
+        <w:rPr>
+          <w:rFonts w:ascii="Arial" w:hAnsi="Arial" w:cs="Arial"/>
+          <w:i/>
+          <w:iCs/>
+          <w:sz w:val="20"/>
+          <w:szCs w:val="20"/>
+        </w:rPr>
+      </w:pPr>
+    </w:p>
+    <w:p>
+      <w:pPr>
+        <w:rPr>
+          <w:rFonts w:ascii="Arial" w:hAnsi="Arial" w:cs="Arial"/>
+          <w:i/>
+          <w:iCs/>
+          <w:sz w:val="20"/>
+          <w:szCs w:val="20"/>
+        </w:rPr>
+      </w:pPr>
+    </w:p>
+    <w:p>
+      <w:pPr>
+        <w:rPr>
+          <w:rFonts w:ascii="Arial" w:hAnsi="Arial" w:cs="Arial"/>
+          <w:i/>
+          <w:iCs/>
+          <w:sz w:val="20"/>
+          <w:szCs w:val="20"/>
+        </w:rPr>
+      </w:pPr>
+    </w:p>
+    <w:p>
+      <w:pPr>
+        <w:rPr>
+          <w:rFonts w:ascii="Arial" w:hAnsi="Arial" w:cs="Arial"/>
+          <w:i/>
+          <w:iCs/>
+          <w:sz w:val="20"/>
+          <w:szCs w:val="20"/>
+        </w:rPr>
+      </w:pPr>
+    </w:p>
+    <w:p>
+      <w:pPr>
+        <w:rPr>
+          <w:rFonts w:ascii="Arial" w:hAnsi="Arial" w:cs="Arial"/>
+          <w:i/>
+          <w:iCs/>
+          <w:sz w:val="20"/>
+          <w:szCs w:val="20"/>
+          <w:lang w:val="en-US"/>
+        </w:rPr>
+      </w:pPr>
+    </w:p>
+    <w:p>
+      <w:pPr>
+        <w:rPr>
+          <w:rFonts w:ascii="Arial" w:hAnsi="Arial" w:cs="Arial"/>
+          <w:i/>
+          <w:iCs/>
+          <w:sz w:val="20"/>
+          <w:szCs w:val="20"/>
+        </w:rPr>
       </w:pPr>
     </w:p>
     <w:p>
@@ -2745,23 +2492,13 @@
           <w:szCs w:val="20"/>
         </w:rPr>
       </w:pPr>
-      <w:proofErr w:type="spellStart"/>
-      <w:r>
-        <w:rPr>
-          <w:rFonts w:ascii="Arial" w:hAnsi="Arial" w:cs="Arial"/>
-          <w:sz w:val="20"/>
-          <w:szCs w:val="20"/>
-        </w:rPr>
-        <w:t>Deliverables</w:t>
-      </w:r>
-      <w:proofErr w:type="spellEnd"/>
-      <w:r>
-        <w:rPr>
-          <w:rFonts w:ascii="Arial" w:hAnsi="Arial" w:cs="Arial"/>
-          <w:sz w:val="20"/>
-          <w:szCs w:val="20"/>
-        </w:rPr>
-        <w:t>:</w:t>
+      <w:r>
+        <w:rPr>
+          <w:rFonts w:ascii="Arial" w:hAnsi="Arial" w:cs="Arial"/>
+          <w:sz w:val="20"/>
+          <w:szCs w:val="20"/>
+        </w:rPr>
+        <w:t>Deliverables:</w:t>
       </w:r>
     </w:p>
     <w:p>
@@ -2781,9 +2518,8 @@
           <w:szCs w:val="20"/>
           <w:lang w:val="en-US"/>
         </w:rPr>
-        <w:t xml:space="preserve">Upload a picture for each test showing actual </w:t>
-      </w:r>
-      <w:proofErr w:type="gramStart"/>
+        <w:t xml:space="preserve">Upload a picture for each test showing actual result. Everything must be updated in individual repository </w:t>
+      </w:r>
       <w:r>
         <w:rPr>
           <w:rFonts w:ascii="Arial" w:hAnsi="Arial" w:cs="Arial"/>
@@ -2791,49 +2527,48 @@
           <w:szCs w:val="20"/>
           <w:lang w:val="en-US"/>
         </w:rPr>
-        <w:t>result</w:t>
-      </w:r>
-      <w:proofErr w:type="gramEnd"/>
-      <w:r>
+        <w:t>and tagged with proper format</w:t>
+      </w:r>
+    </w:p>
+    <w:p>
+      <w:pPr>
+        <w:jc w:val="both"/>
         <w:rPr>
           <w:rFonts w:ascii="Arial" w:hAnsi="Arial" w:cs="Arial"/>
           <w:sz w:val="20"/>
           <w:szCs w:val="20"/>
           <w:lang w:val="en-US"/>
         </w:rPr>
-        <w:t xml:space="preserve">. Everything must be updated in individual repository </w:t>
-      </w:r>
-      <w:r>
+      </w:pPr>
+    </w:p>
+    <w:p>
+      <w:pPr>
+        <w:jc w:val="both"/>
         <w:rPr>
           <w:rFonts w:ascii="Arial" w:hAnsi="Arial" w:cs="Arial"/>
           <w:sz w:val="20"/>
           <w:szCs w:val="20"/>
           <w:lang w:val="en-US"/>
         </w:rPr>
-        <w:t>and tagged with proper format</w:t>
-      </w:r>
-    </w:p>
-    <w:p>
-      <w:pPr>
-        <w:jc w:val="both"/>
+      </w:pPr>
+      <w:r>
         <w:rPr>
           <w:rFonts w:ascii="Arial" w:hAnsi="Arial" w:cs="Arial"/>
           <w:sz w:val="20"/>
           <w:szCs w:val="20"/>
           <w:lang w:val="en-US"/>
         </w:rPr>
-      </w:pPr>
-    </w:p>
-    <w:p>
-      <w:pPr>
-        <w:jc w:val="both"/>
+        <w:t xml:space="preserve">Extra points: 30% if any testbench is executed in </w:t>
+      </w:r>
+      <w:r>
         <w:rPr>
           <w:rFonts w:ascii="Arial" w:hAnsi="Arial" w:cs="Arial"/>
           <w:sz w:val="20"/>
           <w:szCs w:val="20"/>
           <w:lang w:val="en-US"/>
         </w:rPr>
-      </w:pPr>
+        <w:t>Questa Sim</w:t>
+      </w:r>
       <w:r>
         <w:rPr>
           <w:rFonts w:ascii="Arial" w:hAnsi="Arial" w:cs="Arial"/>
@@ -2841,30 +2576,12 @@
           <w:szCs w:val="20"/>
           <w:lang w:val="en-US"/>
         </w:rPr>
-        <w:t xml:space="preserve">Extra points: 30% if any testbench is executed in </w:t>
-      </w:r>
-      <w:r>
-        <w:rPr>
-          <w:rFonts w:ascii="Arial" w:hAnsi="Arial" w:cs="Arial"/>
-          <w:sz w:val="20"/>
-          <w:szCs w:val="20"/>
-          <w:lang w:val="en-US"/>
-        </w:rPr>
-        <w:t>Questa Sim</w:t>
-      </w:r>
-      <w:r>
-        <w:rPr>
-          <w:rFonts w:ascii="Arial" w:hAnsi="Arial" w:cs="Arial"/>
-          <w:sz w:val="20"/>
-          <w:szCs w:val="20"/>
-          <w:lang w:val="en-US"/>
-        </w:rPr>
         <w:t xml:space="preserve"> and screenshots are attached.</w:t>
       </w:r>
     </w:p>
     <w:sectPr>
-      <w:headerReference w:type="default" r:id="rId11"/>
-      <w:footerReference w:type="default" r:id="rId12"/>
+      <w:headerReference w:type="default" r:id="rId12"/>
+      <w:footerReference w:type="default" r:id="rId13"/>
       <w:pgSz w:w="12240" w:h="15840"/>
       <w:pgMar w:top="431" w:right="284" w:bottom="431" w:left="680" w:header="0" w:footer="340" w:gutter="0"/>
       <w:cols w:space="720"/>

</xml_diff>